<commit_message>
Record fresh application verification separately from report study
</commit_message>
<xml_diff>
--- a/docs/reports/FaultNet-final-report-revised.docx
+++ b/docs/reports/FaultNet-final-report-revised.docx
@@ -276,7 +276,7 @@
       <w:r>
         <w:fldChar w:fldCharType="separate"/>
       </w:r>
-      <w:hyperlink w:anchor="_Toc244117033" w:history="1">
+      <w:hyperlink w:anchor="_Toc244118396" w:history="1">
         <w:r>
           <w:rPr>
             <w:rStyle w:val="Hyperlink"/>
@@ -303,7 +303,7 @@
             <w:noProof/>
             <w:webHidden/>
           </w:rPr>
-          <w:instrText xml:space="preserve"> PAGEREF _Toc244117033 \h </w:instrText>
+          <w:instrText xml:space="preserve"> PAGEREF _Toc244118396 \h </w:instrText>
         </w:r>
         <w:r>
           <w:rPr>
@@ -347,7 +347,7 @@
           <w14:ligatures w14:val="standardContextual"/>
         </w:rPr>
       </w:pPr>
-      <w:hyperlink w:anchor="_Toc244117034" w:history="1">
+      <w:hyperlink w:anchor="_Toc244118397" w:history="1">
         <w:r>
           <w:rPr>
             <w:rStyle w:val="Hyperlink"/>
@@ -374,7 +374,7 @@
             <w:noProof/>
             <w:webHidden/>
           </w:rPr>
-          <w:instrText xml:space="preserve"> PAGEREF _Toc244117034 \h </w:instrText>
+          <w:instrText xml:space="preserve"> PAGEREF _Toc244118397 \h </w:instrText>
         </w:r>
         <w:r>
           <w:rPr>
@@ -418,7 +418,7 @@
           <w14:ligatures w14:val="standardContextual"/>
         </w:rPr>
       </w:pPr>
-      <w:hyperlink w:anchor="_Toc244117035" w:history="1">
+      <w:hyperlink w:anchor="_Toc244118398" w:history="1">
         <w:r>
           <w:rPr>
             <w:rStyle w:val="Hyperlink"/>
@@ -445,7 +445,7 @@
             <w:noProof/>
             <w:webHidden/>
           </w:rPr>
-          <w:instrText xml:space="preserve"> PAGEREF _Toc244117035 \h </w:instrText>
+          <w:instrText xml:space="preserve"> PAGEREF _Toc244118398 \h </w:instrText>
         </w:r>
         <w:r>
           <w:rPr>
@@ -489,7 +489,7 @@
           <w14:ligatures w14:val="standardContextual"/>
         </w:rPr>
       </w:pPr>
-      <w:hyperlink w:anchor="_Toc244117036" w:history="1">
+      <w:hyperlink w:anchor="_Toc244118399" w:history="1">
         <w:r>
           <w:rPr>
             <w:rStyle w:val="Hyperlink"/>
@@ -516,7 +516,7 @@
             <w:noProof/>
             <w:webHidden/>
           </w:rPr>
-          <w:instrText xml:space="preserve"> PAGEREF _Toc244117036 \h </w:instrText>
+          <w:instrText xml:space="preserve"> PAGEREF _Toc244118399 \h </w:instrText>
         </w:r>
         <w:r>
           <w:rPr>
@@ -560,7 +560,7 @@
           <w14:ligatures w14:val="standardContextual"/>
         </w:rPr>
       </w:pPr>
-      <w:hyperlink w:anchor="_Toc244117037" w:history="1">
+      <w:hyperlink w:anchor="_Toc244118400" w:history="1">
         <w:r>
           <w:rPr>
             <w:rStyle w:val="Hyperlink"/>
@@ -587,7 +587,7 @@
             <w:noProof/>
             <w:webHidden/>
           </w:rPr>
-          <w:instrText xml:space="preserve"> PAGEREF _Toc244117037 \h </w:instrText>
+          <w:instrText xml:space="preserve"> PAGEREF _Toc244118400 \h </w:instrText>
         </w:r>
         <w:r>
           <w:rPr>
@@ -631,7 +631,7 @@
           <w14:ligatures w14:val="standardContextual"/>
         </w:rPr>
       </w:pPr>
-      <w:hyperlink w:anchor="_Toc244117038" w:history="1">
+      <w:hyperlink w:anchor="_Toc244118401" w:history="1">
         <w:r>
           <w:rPr>
             <w:rStyle w:val="Hyperlink"/>
@@ -658,7 +658,7 @@
             <w:noProof/>
             <w:webHidden/>
           </w:rPr>
-          <w:instrText xml:space="preserve"> PAGEREF _Toc244117038 \h </w:instrText>
+          <w:instrText xml:space="preserve"> PAGEREF _Toc244118401 \h </w:instrText>
         </w:r>
         <w:r>
           <w:rPr>
@@ -702,7 +702,7 @@
           <w14:ligatures w14:val="standardContextual"/>
         </w:rPr>
       </w:pPr>
-      <w:hyperlink w:anchor="_Toc244117039" w:history="1">
+      <w:hyperlink w:anchor="_Toc244118402" w:history="1">
         <w:r>
           <w:rPr>
             <w:rStyle w:val="Hyperlink"/>
@@ -729,7 +729,7 @@
             <w:noProof/>
             <w:webHidden/>
           </w:rPr>
-          <w:instrText xml:space="preserve"> PAGEREF _Toc244117039 \h </w:instrText>
+          <w:instrText xml:space="preserve"> PAGEREF _Toc244118402 \h </w:instrText>
         </w:r>
         <w:r>
           <w:rPr>
@@ -773,7 +773,7 @@
           <w14:ligatures w14:val="standardContextual"/>
         </w:rPr>
       </w:pPr>
-      <w:hyperlink w:anchor="_Toc244117040" w:history="1">
+      <w:hyperlink w:anchor="_Toc244118403" w:history="1">
         <w:r>
           <w:rPr>
             <w:rStyle w:val="Hyperlink"/>
@@ -800,7 +800,7 @@
             <w:noProof/>
             <w:webHidden/>
           </w:rPr>
-          <w:instrText xml:space="preserve"> PAGEREF _Toc244117040 \h </w:instrText>
+          <w:instrText xml:space="preserve"> PAGEREF _Toc244118403 \h </w:instrText>
         </w:r>
         <w:r>
           <w:rPr>
@@ -844,7 +844,7 @@
           <w14:ligatures w14:val="standardContextual"/>
         </w:rPr>
       </w:pPr>
-      <w:hyperlink w:anchor="_Toc244117041" w:history="1">
+      <w:hyperlink w:anchor="_Toc244118404" w:history="1">
         <w:r>
           <w:rPr>
             <w:rStyle w:val="Hyperlink"/>
@@ -871,7 +871,7 @@
             <w:noProof/>
             <w:webHidden/>
           </w:rPr>
-          <w:instrText xml:space="preserve"> PAGEREF _Toc244117041 \h </w:instrText>
+          <w:instrText xml:space="preserve"> PAGEREF _Toc244118404 \h </w:instrText>
         </w:r>
         <w:r>
           <w:rPr>
@@ -915,7 +915,7 @@
           <w14:ligatures w14:val="standardContextual"/>
         </w:rPr>
       </w:pPr>
-      <w:hyperlink w:anchor="_Toc244117042" w:history="1">
+      <w:hyperlink w:anchor="_Toc244118405" w:history="1">
         <w:r>
           <w:rPr>
             <w:rStyle w:val="Hyperlink"/>
@@ -942,7 +942,7 @@
             <w:noProof/>
             <w:webHidden/>
           </w:rPr>
-          <w:instrText xml:space="preserve"> PAGEREF _Toc244117042 \h </w:instrText>
+          <w:instrText xml:space="preserve"> PAGEREF _Toc244118405 \h </w:instrText>
         </w:r>
         <w:r>
           <w:rPr>
@@ -986,7 +986,7 @@
           <w14:ligatures w14:val="standardContextual"/>
         </w:rPr>
       </w:pPr>
-      <w:hyperlink w:anchor="_Toc244117043" w:history="1">
+      <w:hyperlink w:anchor="_Toc244118406" w:history="1">
         <w:r>
           <w:rPr>
             <w:rStyle w:val="Hyperlink"/>
@@ -1013,7 +1013,7 @@
             <w:noProof/>
             <w:webHidden/>
           </w:rPr>
-          <w:instrText xml:space="preserve"> PAGEREF _Toc244117043 \h </w:instrText>
+          <w:instrText xml:space="preserve"> PAGEREF _Toc244118406 \h </w:instrText>
         </w:r>
         <w:r>
           <w:rPr>
@@ -1057,7 +1057,7 @@
           <w14:ligatures w14:val="standardContextual"/>
         </w:rPr>
       </w:pPr>
-      <w:hyperlink w:anchor="_Toc244117044" w:history="1">
+      <w:hyperlink w:anchor="_Toc244118407" w:history="1">
         <w:r>
           <w:rPr>
             <w:rStyle w:val="Hyperlink"/>
@@ -1084,7 +1084,7 @@
             <w:noProof/>
             <w:webHidden/>
           </w:rPr>
-          <w:instrText xml:space="preserve"> PAGEREF _Toc244117044 \h </w:instrText>
+          <w:instrText xml:space="preserve"> PAGEREF _Toc244118407 \h </w:instrText>
         </w:r>
         <w:r>
           <w:rPr>
@@ -1128,7 +1128,7 @@
           <w14:ligatures w14:val="standardContextual"/>
         </w:rPr>
       </w:pPr>
-      <w:hyperlink w:anchor="_Toc244117045" w:history="1">
+      <w:hyperlink w:anchor="_Toc244118408" w:history="1">
         <w:r>
           <w:rPr>
             <w:rStyle w:val="Hyperlink"/>
@@ -1155,7 +1155,7 @@
             <w:noProof/>
             <w:webHidden/>
           </w:rPr>
-          <w:instrText xml:space="preserve"> PAGEREF _Toc244117045 \h </w:instrText>
+          <w:instrText xml:space="preserve"> PAGEREF _Toc244118408 \h </w:instrText>
         </w:r>
         <w:r>
           <w:rPr>
@@ -1199,7 +1199,7 @@
           <w14:ligatures w14:val="standardContextual"/>
         </w:rPr>
       </w:pPr>
-      <w:hyperlink w:anchor="_Toc244117046" w:history="1">
+      <w:hyperlink w:anchor="_Toc244118409" w:history="1">
         <w:r>
           <w:rPr>
             <w:rStyle w:val="Hyperlink"/>
@@ -1226,7 +1226,7 @@
             <w:noProof/>
             <w:webHidden/>
           </w:rPr>
-          <w:instrText xml:space="preserve"> PAGEREF _Toc244117046 \h </w:instrText>
+          <w:instrText xml:space="preserve"> PAGEREF _Toc244118409 \h </w:instrText>
         </w:r>
         <w:r>
           <w:rPr>
@@ -1270,7 +1270,7 @@
           <w14:ligatures w14:val="standardContextual"/>
         </w:rPr>
       </w:pPr>
-      <w:hyperlink w:anchor="_Toc244117047" w:history="1">
+      <w:hyperlink w:anchor="_Toc244118410" w:history="1">
         <w:r>
           <w:rPr>
             <w:rStyle w:val="Hyperlink"/>
@@ -1297,7 +1297,7 @@
             <w:noProof/>
             <w:webHidden/>
           </w:rPr>
-          <w:instrText xml:space="preserve"> PAGEREF _Toc244117047 \h </w:instrText>
+          <w:instrText xml:space="preserve"> PAGEREF _Toc244118410 \h </w:instrText>
         </w:r>
         <w:r>
           <w:rPr>
@@ -1341,7 +1341,7 @@
           <w14:ligatures w14:val="standardContextual"/>
         </w:rPr>
       </w:pPr>
-      <w:hyperlink w:anchor="_Toc244117048" w:history="1">
+      <w:hyperlink w:anchor="_Toc244118411" w:history="1">
         <w:r>
           <w:rPr>
             <w:rStyle w:val="Hyperlink"/>
@@ -1368,7 +1368,7 @@
             <w:noProof/>
             <w:webHidden/>
           </w:rPr>
-          <w:instrText xml:space="preserve"> PAGEREF _Toc244117048 \h </w:instrText>
+          <w:instrText xml:space="preserve"> PAGEREF _Toc244118411 \h </w:instrText>
         </w:r>
         <w:r>
           <w:rPr>
@@ -1412,7 +1412,7 @@
           <w14:ligatures w14:val="standardContextual"/>
         </w:rPr>
       </w:pPr>
-      <w:hyperlink w:anchor="_Toc244117049" w:history="1">
+      <w:hyperlink w:anchor="_Toc244118412" w:history="1">
         <w:r>
           <w:rPr>
             <w:rStyle w:val="Hyperlink"/>
@@ -1439,7 +1439,7 @@
             <w:noProof/>
             <w:webHidden/>
           </w:rPr>
-          <w:instrText xml:space="preserve"> PAGEREF _Toc244117049 \h </w:instrText>
+          <w:instrText xml:space="preserve"> PAGEREF _Toc244118412 \h </w:instrText>
         </w:r>
         <w:r>
           <w:rPr>
@@ -1485,7 +1485,7 @@
           <w14:ligatures w14:val="standardContextual"/>
         </w:rPr>
       </w:pPr>
-      <w:hyperlink w:anchor="_Toc244117050" w:history="1">
+      <w:hyperlink w:anchor="_Toc244118413" w:history="1">
         <w:r>
           <w:rPr>
             <w:rStyle w:val="Hyperlink"/>
@@ -1512,7 +1512,7 @@
             <w:noProof/>
             <w:webHidden/>
           </w:rPr>
-          <w:instrText xml:space="preserve"> PAGEREF _Toc244117050 \h </w:instrText>
+          <w:instrText xml:space="preserve"> PAGEREF _Toc244118413 \h </w:instrText>
         </w:r>
         <w:r>
           <w:rPr>
@@ -1558,7 +1558,7 @@
           <w14:ligatures w14:val="standardContextual"/>
         </w:rPr>
       </w:pPr>
-      <w:hyperlink w:anchor="_Toc244117051" w:history="1">
+      <w:hyperlink w:anchor="_Toc244118414" w:history="1">
         <w:r>
           <w:rPr>
             <w:rStyle w:val="Hyperlink"/>
@@ -1585,7 +1585,7 @@
             <w:noProof/>
             <w:webHidden/>
           </w:rPr>
-          <w:instrText xml:space="preserve"> PAGEREF _Toc244117051 \h </w:instrText>
+          <w:instrText xml:space="preserve"> PAGEREF _Toc244118414 \h </w:instrText>
         </w:r>
         <w:r>
           <w:rPr>
@@ -1631,7 +1631,7 @@
           <w14:ligatures w14:val="standardContextual"/>
         </w:rPr>
       </w:pPr>
-      <w:hyperlink w:anchor="_Toc244117052" w:history="1">
+      <w:hyperlink w:anchor="_Toc244118415" w:history="1">
         <w:r>
           <w:rPr>
             <w:rStyle w:val="Hyperlink"/>
@@ -1658,7 +1658,7 @@
             <w:noProof/>
             <w:webHidden/>
           </w:rPr>
-          <w:instrText xml:space="preserve"> PAGEREF _Toc244117052 \h </w:instrText>
+          <w:instrText xml:space="preserve"> PAGEREF _Toc244118415 \h </w:instrText>
         </w:r>
         <w:r>
           <w:rPr>
@@ -1704,7 +1704,7 @@
           <w14:ligatures w14:val="standardContextual"/>
         </w:rPr>
       </w:pPr>
-      <w:hyperlink w:anchor="_Toc244117053" w:history="1">
+      <w:hyperlink w:anchor="_Toc244118416" w:history="1">
         <w:r>
           <w:rPr>
             <w:rStyle w:val="Hyperlink"/>
@@ -1731,7 +1731,7 @@
             <w:noProof/>
             <w:webHidden/>
           </w:rPr>
-          <w:instrText xml:space="preserve"> PAGEREF _Toc244117053 \h </w:instrText>
+          <w:instrText xml:space="preserve"> PAGEREF _Toc244118416 \h </w:instrText>
         </w:r>
         <w:r>
           <w:rPr>
@@ -1777,7 +1777,7 @@
           <w14:ligatures w14:val="standardContextual"/>
         </w:rPr>
       </w:pPr>
-      <w:hyperlink w:anchor="_Toc244117054" w:history="1">
+      <w:hyperlink w:anchor="_Toc244118417" w:history="1">
         <w:r>
           <w:rPr>
             <w:rStyle w:val="Hyperlink"/>
@@ -1804,7 +1804,7 @@
             <w:noProof/>
             <w:webHidden/>
           </w:rPr>
-          <w:instrText xml:space="preserve"> PAGEREF _Toc244117054 \h </w:instrText>
+          <w:instrText xml:space="preserve"> PAGEREF _Toc244118417 \h </w:instrText>
         </w:r>
         <w:r>
           <w:rPr>
@@ -1850,7 +1850,7 @@
           <w14:ligatures w14:val="standardContextual"/>
         </w:rPr>
       </w:pPr>
-      <w:hyperlink w:anchor="_Toc244117055" w:history="1">
+      <w:hyperlink w:anchor="_Toc244118418" w:history="1">
         <w:r>
           <w:rPr>
             <w:rStyle w:val="Hyperlink"/>
@@ -1877,7 +1877,7 @@
             <w:noProof/>
             <w:webHidden/>
           </w:rPr>
-          <w:instrText xml:space="preserve"> PAGEREF _Toc244117055 \h </w:instrText>
+          <w:instrText xml:space="preserve"> PAGEREF _Toc244118418 \h </w:instrText>
         </w:r>
         <w:r>
           <w:rPr>
@@ -1923,7 +1923,7 @@
           <w14:ligatures w14:val="standardContextual"/>
         </w:rPr>
       </w:pPr>
-      <w:hyperlink w:anchor="_Toc244117056" w:history="1">
+      <w:hyperlink w:anchor="_Toc244118419" w:history="1">
         <w:r>
           <w:rPr>
             <w:rStyle w:val="Hyperlink"/>
@@ -1950,7 +1950,7 @@
             <w:noProof/>
             <w:webHidden/>
           </w:rPr>
-          <w:instrText xml:space="preserve"> PAGEREF _Toc244117056 \h </w:instrText>
+          <w:instrText xml:space="preserve"> PAGEREF _Toc244118419 \h </w:instrText>
         </w:r>
         <w:r>
           <w:rPr>
@@ -1994,7 +1994,7 @@
           <w14:ligatures w14:val="standardContextual"/>
         </w:rPr>
       </w:pPr>
-      <w:hyperlink w:anchor="_Toc244117057" w:history="1">
+      <w:hyperlink w:anchor="_Toc244118420" w:history="1">
         <w:r>
           <w:rPr>
             <w:rStyle w:val="Hyperlink"/>
@@ -2021,7 +2021,7 @@
             <w:noProof/>
             <w:webHidden/>
           </w:rPr>
-          <w:instrText xml:space="preserve"> PAGEREF _Toc244117057 \h </w:instrText>
+          <w:instrText xml:space="preserve"> PAGEREF _Toc244118420 \h </w:instrText>
         </w:r>
         <w:r>
           <w:rPr>
@@ -2065,7 +2065,7 @@
           <w14:ligatures w14:val="standardContextual"/>
         </w:rPr>
       </w:pPr>
-      <w:hyperlink w:anchor="_Toc244117058" w:history="1">
+      <w:hyperlink w:anchor="_Toc244118421" w:history="1">
         <w:r>
           <w:rPr>
             <w:rStyle w:val="Hyperlink"/>
@@ -2092,7 +2092,7 @@
             <w:noProof/>
             <w:webHidden/>
           </w:rPr>
-          <w:instrText xml:space="preserve"> PAGEREF _Toc244117058 \h </w:instrText>
+          <w:instrText xml:space="preserve"> PAGEREF _Toc244118421 \h </w:instrText>
         </w:r>
         <w:r>
           <w:rPr>
@@ -2136,7 +2136,7 @@
           <w14:ligatures w14:val="standardContextual"/>
         </w:rPr>
       </w:pPr>
-      <w:hyperlink w:anchor="_Toc244117059" w:history="1">
+      <w:hyperlink w:anchor="_Toc244118422" w:history="1">
         <w:r>
           <w:rPr>
             <w:rStyle w:val="Hyperlink"/>
@@ -2163,7 +2163,7 @@
             <w:noProof/>
             <w:webHidden/>
           </w:rPr>
-          <w:instrText xml:space="preserve"> PAGEREF _Toc244117059 \h </w:instrText>
+          <w:instrText xml:space="preserve"> PAGEREF _Toc244118422 \h </w:instrText>
         </w:r>
         <w:r>
           <w:rPr>
@@ -2207,7 +2207,7 @@
           <w14:ligatures w14:val="standardContextual"/>
         </w:rPr>
       </w:pPr>
-      <w:hyperlink w:anchor="_Toc244117060" w:history="1">
+      <w:hyperlink w:anchor="_Toc244118423" w:history="1">
         <w:r>
           <w:rPr>
             <w:rStyle w:val="Hyperlink"/>
@@ -2234,7 +2234,7 @@
             <w:noProof/>
             <w:webHidden/>
           </w:rPr>
-          <w:instrText xml:space="preserve"> PAGEREF _Toc244117060 \h </w:instrText>
+          <w:instrText xml:space="preserve"> PAGEREF _Toc244118423 \h </w:instrText>
         </w:r>
         <w:r>
           <w:rPr>
@@ -2278,7 +2278,7 @@
           <w14:ligatures w14:val="standardContextual"/>
         </w:rPr>
       </w:pPr>
-      <w:hyperlink w:anchor="_Toc244117061" w:history="1">
+      <w:hyperlink w:anchor="_Toc244118424" w:history="1">
         <w:r>
           <w:rPr>
             <w:rStyle w:val="Hyperlink"/>
@@ -2305,7 +2305,7 @@
             <w:noProof/>
             <w:webHidden/>
           </w:rPr>
-          <w:instrText xml:space="preserve"> PAGEREF _Toc244117061 \h </w:instrText>
+          <w:instrText xml:space="preserve"> PAGEREF _Toc244118424 \h </w:instrText>
         </w:r>
         <w:r>
           <w:rPr>
@@ -2349,7 +2349,7 @@
           <w14:ligatures w14:val="standardContextual"/>
         </w:rPr>
       </w:pPr>
-      <w:hyperlink w:anchor="_Toc244117062" w:history="1">
+      <w:hyperlink w:anchor="_Toc244118425" w:history="1">
         <w:r>
           <w:rPr>
             <w:rStyle w:val="Hyperlink"/>
@@ -2376,7 +2376,7 @@
             <w:noProof/>
             <w:webHidden/>
           </w:rPr>
-          <w:instrText xml:space="preserve"> PAGEREF _Toc244117062 \h </w:instrText>
+          <w:instrText xml:space="preserve"> PAGEREF _Toc244118425 \h </w:instrText>
         </w:r>
         <w:r>
           <w:rPr>
@@ -2420,7 +2420,7 @@
           <w14:ligatures w14:val="standardContextual"/>
         </w:rPr>
       </w:pPr>
-      <w:hyperlink w:anchor="_Toc244117063" w:history="1">
+      <w:hyperlink w:anchor="_Toc244118426" w:history="1">
         <w:r>
           <w:rPr>
             <w:rStyle w:val="Hyperlink"/>
@@ -2447,7 +2447,7 @@
             <w:noProof/>
             <w:webHidden/>
           </w:rPr>
-          <w:instrText xml:space="preserve"> PAGEREF _Toc244117063 \h </w:instrText>
+          <w:instrText xml:space="preserve"> PAGEREF _Toc244118426 \h </w:instrText>
         </w:r>
         <w:r>
           <w:rPr>
@@ -2491,7 +2491,7 @@
           <w14:ligatures w14:val="standardContextual"/>
         </w:rPr>
       </w:pPr>
-      <w:hyperlink w:anchor="_Toc244117064" w:history="1">
+      <w:hyperlink w:anchor="_Toc244118427" w:history="1">
         <w:r>
           <w:rPr>
             <w:rStyle w:val="Hyperlink"/>
@@ -2518,7 +2518,7 @@
             <w:noProof/>
             <w:webHidden/>
           </w:rPr>
-          <w:instrText xml:space="preserve"> PAGEREF _Toc244117064 \h </w:instrText>
+          <w:instrText xml:space="preserve"> PAGEREF _Toc244118427 \h </w:instrText>
         </w:r>
         <w:r>
           <w:rPr>
@@ -2562,7 +2562,7 @@
         <w:pStyle w:val="Heading1"/>
         <w:pageBreakBefore/>
       </w:pPr>
-      <w:bookmarkStart w:id="0" w:name="_Toc244117033"/>
+      <w:bookmarkStart w:id="0" w:name="_Toc244118396"/>
       <w:r>
         <w:lastRenderedPageBreak/>
         <w:t>1. Introduction</w:t>
@@ -2597,7 +2597,7 @@
       <w:pPr>
         <w:pStyle w:val="Heading2"/>
       </w:pPr>
-      <w:bookmarkStart w:id="1" w:name="_Toc244117034"/>
+      <w:bookmarkStart w:id="1" w:name="_Toc244118397"/>
       <w:r>
         <w:t>1.1 Practical Applications</w:t>
       </w:r>
@@ -2623,7 +2623,7 @@
       <w:pPr>
         <w:pStyle w:val="Heading1"/>
       </w:pPr>
-      <w:bookmarkStart w:id="2" w:name="_Toc244117035"/>
+      <w:bookmarkStart w:id="2" w:name="_Toc244118398"/>
       <w:r>
         <w:t>2. Problem Statement</w:t>
       </w:r>
@@ -2649,7 +2649,7 @@
       <w:pPr>
         <w:pStyle w:val="Heading1"/>
       </w:pPr>
-      <w:bookmarkStart w:id="3" w:name="_Toc244117036"/>
+      <w:bookmarkStart w:id="3" w:name="_Toc244118399"/>
       <w:r>
         <w:lastRenderedPageBreak/>
         <w:t>3. Objectives</w:t>
@@ -2716,7 +2716,7 @@
       <w:pPr>
         <w:pStyle w:val="Heading1"/>
       </w:pPr>
-      <w:bookmarkStart w:id="4" w:name="_Toc244117037"/>
+      <w:bookmarkStart w:id="4" w:name="_Toc244118400"/>
       <w:r>
         <w:t>4. Literature Review and Existing System</w:t>
       </w:r>
@@ -3635,7 +3635,7 @@
       <w:pPr>
         <w:pStyle w:val="Heading1"/>
       </w:pPr>
-      <w:bookmarkStart w:id="5" w:name="_Toc244117038"/>
+      <w:bookmarkStart w:id="5" w:name="_Toc244118401"/>
       <w:r>
         <w:t>5. Abstract</w:t>
       </w:r>
@@ -3659,7 +3659,7 @@
       <w:pPr>
         <w:pStyle w:val="Heading1"/>
       </w:pPr>
-      <w:bookmarkStart w:id="6" w:name="_Toc244117039"/>
+      <w:bookmarkStart w:id="6" w:name="_Toc244118402"/>
       <w:r>
         <w:t>6. Workflow of the Proposed Project work and System Architecture</w:t>
       </w:r>
@@ -4114,7 +4114,7 @@
         </w:rPr>
         <w:lastRenderedPageBreak/>
         <w:drawing>
-          <wp:inline distT="0" distB="0" distL="0" distR="0" wp14:anchorId="06180293" wp14:editId="622762D2">
+          <wp:inline distT="0" distB="0" distL="0" distR="0" wp14:anchorId="57E9C709" wp14:editId="3E8588D3">
             <wp:extent cx="5577840" cy="3022829"/>
             <wp:effectExtent l="0" t="0" r="0" b="0"/>
             <wp:docPr id="2" name="Picture 2" descr="Control and data paths in FaultNet. The workbench and live proxy have independent fault configurations; replies return through the same proxy path."/>
@@ -4174,7 +4174,7 @@
       <w:pPr>
         <w:pStyle w:val="Heading2"/>
       </w:pPr>
-      <w:bookmarkStart w:id="7" w:name="_Toc244117040"/>
+      <w:bookmarkStart w:id="7" w:name="_Toc244118403"/>
       <w:r>
         <w:t>6.1 Dashboard Roles and Separation</w:t>
       </w:r>
@@ -4689,7 +4689,7 @@
       <w:pPr>
         <w:pStyle w:val="Heading2"/>
       </w:pPr>
-      <w:bookmarkStart w:id="8" w:name="_Toc244117041"/>
+      <w:bookmarkStart w:id="8" w:name="_Toc244118404"/>
       <w:r>
         <w:lastRenderedPageBreak/>
         <w:t>6.2 Workbench Functions and Fault Mechanisms</w:t>
@@ -5071,7 +5071,7 @@
       <w:pPr>
         <w:pStyle w:val="Heading2"/>
       </w:pPr>
-      <w:bookmarkStart w:id="9" w:name="_Toc244117042"/>
+      <w:bookmarkStart w:id="9" w:name="_Toc244118405"/>
       <w:r>
         <w:t>6.3 Live Proxy Cockpit Functions</w:t>
       </w:r>
@@ -5506,7 +5506,7 @@
       <w:pPr>
         <w:pStyle w:val="Heading1"/>
       </w:pPr>
-      <w:bookmarkStart w:id="10" w:name="_Toc244117043"/>
+      <w:bookmarkStart w:id="10" w:name="_Toc244118406"/>
       <w:r>
         <w:t>7. Contribution of Individual Team Member</w:t>
       </w:r>
@@ -5796,7 +5796,7 @@
       <w:pPr>
         <w:pStyle w:val="Heading1"/>
       </w:pPr>
-      <w:bookmarkStart w:id="11" w:name="_Toc244117044"/>
+      <w:bookmarkStart w:id="11" w:name="_Toc244118407"/>
       <w:r>
         <w:t>8. Modules Explanation</w:t>
       </w:r>
@@ -6475,7 +6475,7 @@
       <w:pPr>
         <w:pStyle w:val="Heading1"/>
       </w:pPr>
-      <w:bookmarkStart w:id="12" w:name="_Toc244117045"/>
+      <w:bookmarkStart w:id="12" w:name="_Toc244118408"/>
       <w:r>
         <w:t>9. Project Implementation</w:t>
       </w:r>
@@ -6485,7 +6485,7 @@
       <w:pPr>
         <w:pStyle w:val="Heading2"/>
       </w:pPr>
-      <w:bookmarkStart w:id="13" w:name="_Toc244117046"/>
+      <w:bookmarkStart w:id="13" w:name="_Toc244118409"/>
       <w:r>
         <w:t>9.1 Experimental Setup with Hardware and Software Requirements</w:t>
       </w:r>
@@ -7068,7 +7068,7 @@
       <w:pPr>
         <w:pStyle w:val="Heading2"/>
       </w:pPr>
-      <w:bookmarkStart w:id="14" w:name="_Toc244117047"/>
+      <w:bookmarkStart w:id="14" w:name="_Toc244118410"/>
       <w:r>
         <w:t>9.2 Test Cases</w:t>
       </w:r>
@@ -7689,7 +7689,7 @@
       <w:pPr>
         <w:pStyle w:val="Heading2"/>
       </w:pPr>
-      <w:bookmarkStart w:id="15" w:name="_Toc244117048"/>
+      <w:bookmarkStart w:id="15" w:name="_Toc244118411"/>
       <w:r>
         <w:t>9.3 Results of Execution and Screenshots</w:t>
       </w:r>
@@ -7725,7 +7725,7 @@
         </w:rPr>
         <w:lastRenderedPageBreak/>
         <w:drawing>
-          <wp:inline distT="0" distB="0" distL="0" distR="0" wp14:anchorId="1C06EC95" wp14:editId="50AEBEE2">
+          <wp:inline distT="0" distB="0" distL="0" distR="0" wp14:anchorId="23DED75A" wp14:editId="36F86339">
             <wp:extent cx="5577840" cy="3487618"/>
             <wp:effectExtent l="0" t="0" r="0" b="0"/>
             <wp:docPr id="3" name="Picture 3" descr="Representative workbench interface showing settings, phase comparisons, successful timing and recovery evidence. Displayed example values are not the repeated-study aggregate."/>
@@ -9177,7 +9177,7 @@
       <w:pPr>
         <w:pStyle w:val="Heading2"/>
       </w:pPr>
-      <w:bookmarkStart w:id="16" w:name="_Toc244117049"/>
+      <w:bookmarkStart w:id="16" w:name="_Toc244118412"/>
       <w:r>
         <w:lastRenderedPageBreak/>
         <w:t>9.4 Performance Analysis and Comparison of Methods</w:t>
@@ -9188,7 +9188,7 @@
       <w:pPr>
         <w:pStyle w:val="Heading3"/>
       </w:pPr>
-      <w:bookmarkStart w:id="17" w:name="_Toc244117050"/>
+      <w:bookmarkStart w:id="17" w:name="_Toc244118413"/>
       <w:r>
         <w:t>9.4.1 Delay Calibration and Distribution</w:t>
       </w:r>
@@ -9744,7 +9744,7 @@
           <w:noProof/>
         </w:rPr>
         <w:drawing>
-          <wp:inline distT="0" distB="0" distL="0" distR="0" wp14:anchorId="5ADDCB20" wp14:editId="09C68177">
+          <wp:inline distT="0" distB="0" distL="0" distR="0" wp14:anchorId="72035F24" wp14:editId="0665D554">
             <wp:extent cx="5577840" cy="3003728"/>
             <wp:effectExtent l="0" t="0" r="0" b="0"/>
             <wp:docPr id="4" name="Picture 4" descr="Configured delay versus paired measured increase. Error bars are exploratory bootstrap intervals across ten runs."/>
@@ -9814,7 +9814,7 @@
         </w:rPr>
         <w:lastRenderedPageBreak/>
         <w:drawing>
-          <wp:inline distT="0" distB="0" distL="0" distR="0" wp14:anchorId="1F6168DB" wp14:editId="77005CFE">
+          <wp:inline distT="0" distB="0" distL="0" distR="0" wp14:anchorId="0BB5A4B3" wp14:editId="527C2ECF">
             <wp:extent cx="5577840" cy="3001801"/>
             <wp:effectExtent l="0" t="0" r="0" b="0"/>
             <wp:docPr id="5" name="Picture 5" descr="Empirical distributions of successful faulty response times; 50 observations per configured delay. Curves show separation and within-condition variation."/>
@@ -9874,7 +9874,7 @@
       <w:pPr>
         <w:pStyle w:val="Heading3"/>
       </w:pPr>
-      <w:bookmarkStart w:id="18" w:name="_Toc244117051"/>
+      <w:bookmarkStart w:id="18" w:name="_Toc244118414"/>
       <w:r>
         <w:t>9.4.2 Bandwidth Shaping and Rate Attainment</w:t>
       </w:r>
@@ -10428,7 +10428,7 @@
         </w:rPr>
         <w:lastRenderedPageBreak/>
         <w:drawing>
-          <wp:inline distT="0" distB="0" distL="0" distR="0" wp14:anchorId="63FC6865" wp14:editId="653DC8B9">
+          <wp:inline distT="0" distB="0" distL="0" distR="0" wp14:anchorId="011C957E" wp14:editId="409FB187">
             <wp:extent cx="5577840" cy="3001801"/>
             <wp:effectExtent l="0" t="0" r="0" b="0"/>
             <wp:docPr id="6" name="Picture 6" descr="Measured whole-request goodput versus configured restriction for the same 64 KiB payload."/>
@@ -10499,7 +10499,7 @@
       <w:pPr>
         <w:pStyle w:val="Heading3"/>
       </w:pPr>
-      <w:bookmarkStart w:id="19" w:name="_Toc244117052"/>
+      <w:bookmarkStart w:id="19" w:name="_Toc244118415"/>
       <w:r>
         <w:t>9.4.3 Timeout Tradeoff and Failure Outcomes</w:t>
       </w:r>
@@ -10515,7 +10515,7 @@
           <w:noProof/>
         </w:rPr>
         <w:drawing>
-          <wp:inline distT="0" distB="0" distL="0" distR="0" wp14:anchorId="0E4A5FD7" wp14:editId="564B6D88">
+          <wp:inline distT="0" distB="0" distL="0" distR="0" wp14:anchorId="496A6F12" wp14:editId="1333E17B">
             <wp:extent cx="5577840" cy="2833643"/>
             <wp:effectExtent l="0" t="0" r="0" b="0"/>
             <wp:docPr id="7" name="Picture 7" descr="Fixed 1,000 ms injected delay with two client deadlines. The duration panel distinguishes failed waiting time from successful response latency."/>
@@ -10584,7 +10584,7 @@
       <w:pPr>
         <w:pStyle w:val="Heading3"/>
       </w:pPr>
-      <w:bookmarkStart w:id="20" w:name="_Toc244117053"/>
+      <w:bookmarkStart w:id="20" w:name="_Toc244118416"/>
       <w:r>
         <w:t>9.4.4 Interception Cost and Recovery</w:t>
       </w:r>
@@ -10608,7 +10608,7 @@
           <w:noProof/>
         </w:rPr>
         <w:drawing>
-          <wp:inline distT="0" distB="0" distL="0" distR="0" wp14:anchorId="26B5DD9D" wp14:editId="2A039665">
+          <wp:inline distT="0" distB="0" distL="0" distR="0" wp14:anchorId="485DDA4A" wp14:editId="538C21F9">
             <wp:extent cx="5577840" cy="3087669"/>
             <wp:effectExtent l="0" t="0" r="0" b="0"/>
             <wp:docPr id="8" name="Picture 8" descr="Baseline and recovered successful response times for selected conditions; Table 13 covers all ten. Recovery phase medians and confirmation duration are distinct metrics."/>
@@ -11797,7 +11797,7 @@
       <w:pPr>
         <w:pStyle w:val="Heading3"/>
       </w:pPr>
-      <w:bookmarkStart w:id="21" w:name="_Toc244117054"/>
+      <w:bookmarkStart w:id="21" w:name="_Toc244118417"/>
       <w:r>
         <w:t>9.4.5 Live Proxy Evaluation</w:t>
       </w:r>
@@ -11813,7 +11813,7 @@
           <w:noProof/>
         </w:rPr>
         <w:drawing>
-          <wp:inline distT="0" distB="0" distL="0" distR="0" wp14:anchorId="66AD69AB" wp14:editId="25BBC22E">
+          <wp:inline distT="0" distB="0" distL="0" distR="0" wp14:anchorId="4200262C" wp14:editId="1AC54239">
             <wp:extent cx="5577840" cy="2915933"/>
             <wp:effectExtent l="0" t="0" r="0" b="0"/>
             <wp:docPr id="9" name="Picture 9" descr="Individual live attempt durations under normal, delayed, jittered and rate-restricted configurations; ten observations per condition, with black median markers."/>
@@ -13024,7 +13024,7 @@
       <w:pPr>
         <w:pStyle w:val="Heading3"/>
       </w:pPr>
-      <w:bookmarkStart w:id="22" w:name="_Toc244117055"/>
+      <w:bookmarkStart w:id="22" w:name="_Toc244118418"/>
       <w:r>
         <w:t>9.4.6 Packet Evidence and Timing Correlation</w:t>
       </w:r>
@@ -13499,7 +13499,7 @@
         </w:rPr>
         <w:lastRenderedPageBreak/>
         <w:drawing>
-          <wp:inline distT="0" distB="0" distL="0" distR="0" wp14:anchorId="2F151842" wp14:editId="575062A2">
+          <wp:inline distT="0" distB="0" distL="0" distR="0" wp14:anchorId="1C8A4F30" wp14:editId="010CAD0C">
             <wp:extent cx="5577840" cy="3172486"/>
             <wp:effectExtent l="0" t="0" r="0" b="0"/>
             <wp:docPr id="10" name="Picture 10" descr="Measured request and response timing extracted with TShark from the loopback capture. This is an analytical packet view, not a simulated Wireshark screenshot."/>
@@ -13562,7 +13562,7 @@
       <w:pPr>
         <w:pStyle w:val="Heading3"/>
       </w:pPr>
-      <w:bookmarkStart w:id="23" w:name="_Toc244117056"/>
+      <w:bookmarkStart w:id="23" w:name="_Toc244118419"/>
       <w:r>
         <w:t>9.4.7 Routing Comparison in Packet Tracer</w:t>
       </w:r>
@@ -13578,7 +13578,7 @@
           <w:noProof/>
         </w:rPr>
         <w:drawing>
-          <wp:inline distT="0" distB="0" distL="0" distR="0" wp14:anchorId="41E4C5B5" wp14:editId="008176F7">
+          <wp:inline distT="0" distB="0" distL="0" distR="0" wp14:anchorId="5E575935" wp14:editId="58063AC4">
             <wp:extent cx="5577840" cy="2824086"/>
             <wp:effectExtent l="0" t="0" r="0" b="0"/>
             <wp:docPr id="11" name="Picture 11" descr="Reviewed Packet Tracer topology with three routers, three switches and six PCs. The router triangle offers an alternate R1–R3–R2 path."/>
@@ -14095,7 +14095,7 @@
           <w:noProof/>
         </w:rPr>
         <w:drawing>
-          <wp:inline distT="0" distB="0" distL="0" distR="0" wp14:anchorId="01BD9CC7" wp14:editId="623436DD">
+          <wp:inline distT="0" distB="0" distL="0" distR="0" wp14:anchorId="020967D2" wp14:editId="3DE08502">
             <wp:extent cx="5577840" cy="2915933"/>
             <wp:effectExtent l="0" t="0" r="0" b="0"/>
             <wp:docPr id="12" name="Picture 12" descr="Descriptive reachability comparison of reviewed four-ping batches. Bars are observations of this topology, not reliability estimates for each protocol."/>
@@ -14227,7 +14227,7 @@
       <w:pPr>
         <w:pStyle w:val="Heading2"/>
       </w:pPr>
-      <w:bookmarkStart w:id="24" w:name="_Toc244117057"/>
+      <w:bookmarkStart w:id="24" w:name="_Toc244118420"/>
       <w:r>
         <w:t>9.5 Critical Evaluation and Optimization</w:t>
       </w:r>
@@ -14261,7 +14261,7 @@
       <w:pPr>
         <w:pStyle w:val="Heading1"/>
       </w:pPr>
-      <w:bookmarkStart w:id="25" w:name="_Toc244117058"/>
+      <w:bookmarkStart w:id="25" w:name="_Toc244118421"/>
       <w:r>
         <w:t>10. Results and Discussion</w:t>
       </w:r>
@@ -14271,7 +14271,7 @@
       <w:pPr>
         <w:pStyle w:val="Heading2"/>
       </w:pPr>
-      <w:bookmarkStart w:id="26" w:name="_Toc244117059"/>
+      <w:bookmarkStart w:id="26" w:name="_Toc244118422"/>
       <w:r>
         <w:t>10.1 Findings and Inferences</w:t>
       </w:r>
@@ -14313,7 +14313,7 @@
       <w:pPr>
         <w:pStyle w:val="Heading2"/>
       </w:pPr>
-      <w:bookmarkStart w:id="27" w:name="_Toc244117060"/>
+      <w:bookmarkStart w:id="27" w:name="_Toc244118423"/>
       <w:r>
         <w:lastRenderedPageBreak/>
         <w:t>10.2 Innovation Novelty and Evidence</w:t>
@@ -14343,7 +14343,7 @@
       <w:pPr>
         <w:pStyle w:val="Heading1"/>
       </w:pPr>
-      <w:bookmarkStart w:id="28" w:name="_Toc244117061"/>
+      <w:bookmarkStart w:id="28" w:name="_Toc244118424"/>
       <w:r>
         <w:t>11. Conclusion</w:t>
       </w:r>
@@ -14364,7 +14364,7 @@
       <w:pPr>
         <w:pStyle w:val="Heading1"/>
       </w:pPr>
-      <w:bookmarkStart w:id="29" w:name="_Toc244117062"/>
+      <w:bookmarkStart w:id="29" w:name="_Toc244118425"/>
       <w:r>
         <w:t>12. Limitations and Future Enhancement</w:t>
       </w:r>
@@ -14407,7 +14407,7 @@
         <w:pStyle w:val="Heading1"/>
         <w:pageBreakBefore/>
       </w:pPr>
-      <w:bookmarkStart w:id="30" w:name="_Toc244117063"/>
+      <w:bookmarkStart w:id="30" w:name="_Toc244118426"/>
       <w:r>
         <w:lastRenderedPageBreak/>
         <w:t>References</w:t>
@@ -14615,7 +14615,7 @@
         <w:pStyle w:val="Heading1"/>
         <w:pageBreakBefore/>
       </w:pPr>
-      <w:bookmarkStart w:id="31" w:name="_Toc244117064"/>
+      <w:bookmarkStart w:id="31" w:name="_Toc244118427"/>
       <w:r>
         <w:lastRenderedPageBreak/>
         <w:t>Appendix A Reproduction Procedure</w:t>
@@ -14666,6 +14666,17 @@
       </w:r>
       <w:r>
         <w:t>vidence guide for optional loopback capture and packet correlation.</w:t>
+      </w:r>
+    </w:p>
+    <w:p>
+      <w:pPr>
+        <w:jc w:val="both"/>
+      </w:pPr>
+      <w:r>
+        <w:t>Separate confirmation check. A fresh execution of the unchanged application passed all 61 automated tests with zero failures, skips or cancellations. One additional run of each of the ten workbench conditions produced 130 phase observations (50 baseline, 50 faulty and 30 recovery); all ten records saved successfully and confirmed recovery, with no validation rejection. Interruption and the 500 ms deadline produced 0/5 faulty successes; the remaining conditions produced 5/5. Eight live configurations were ex</w:t>
+      </w:r>
+      <w:r>
+        <w:t>ercised with ten samples each, and the final reset returned HTTP 200 with 65,536 bytes. This bounded confirmation is recorded in evidence/followup-verification.json and is separate from the original 100-run study: it does not replace its statistics, intervals, packet capture or routing observations.</w:t>
       </w:r>
     </w:p>
     <w:sectPr>
@@ -26374,7 +26385,7 @@
     <w:autoRedefine/>
     <w:uiPriority w:val="39"/>
     <w:unhideWhenUsed/>
-    <w:rsid w:val="00736A22"/>
+    <w:rsid w:val="00F25C3D"/>
     <w:pPr>
       <w:spacing w:after="100"/>
       <w:ind w:left="480"/>

</xml_diff>

<commit_message>
Add actual cockpit screenshot and readable monitor view to report
</commit_message>
<xml_diff>
--- a/docs/reports/FaultNet-final-report-revised.docx
+++ b/docs/reports/FaultNet-final-report-revised.docx
@@ -276,7 +276,7 @@
       <w:r>
         <w:fldChar w:fldCharType="separate"/>
       </w:r>
-      <w:hyperlink w:anchor="_Toc244118396" w:history="1">
+      <w:hyperlink w:anchor="_Toc244118944" w:history="1">
         <w:r>
           <w:rPr>
             <w:rStyle w:val="Hyperlink"/>
@@ -303,7 +303,7 @@
             <w:noProof/>
             <w:webHidden/>
           </w:rPr>
-          <w:instrText xml:space="preserve"> PAGEREF _Toc244118396 \h </w:instrText>
+          <w:instrText xml:space="preserve"> PAGEREF _Toc244118944 \h </w:instrText>
         </w:r>
         <w:r>
           <w:rPr>
@@ -347,7 +347,7 @@
           <w14:ligatures w14:val="standardContextual"/>
         </w:rPr>
       </w:pPr>
-      <w:hyperlink w:anchor="_Toc244118397" w:history="1">
+      <w:hyperlink w:anchor="_Toc244118945" w:history="1">
         <w:r>
           <w:rPr>
             <w:rStyle w:val="Hyperlink"/>
@@ -374,7 +374,7 @@
             <w:noProof/>
             <w:webHidden/>
           </w:rPr>
-          <w:instrText xml:space="preserve"> PAGEREF _Toc244118397 \h </w:instrText>
+          <w:instrText xml:space="preserve"> PAGEREF _Toc244118945 \h </w:instrText>
         </w:r>
         <w:r>
           <w:rPr>
@@ -418,7 +418,7 @@
           <w14:ligatures w14:val="standardContextual"/>
         </w:rPr>
       </w:pPr>
-      <w:hyperlink w:anchor="_Toc244118398" w:history="1">
+      <w:hyperlink w:anchor="_Toc244118946" w:history="1">
         <w:r>
           <w:rPr>
             <w:rStyle w:val="Hyperlink"/>
@@ -445,7 +445,7 @@
             <w:noProof/>
             <w:webHidden/>
           </w:rPr>
-          <w:instrText xml:space="preserve"> PAGEREF _Toc244118398 \h </w:instrText>
+          <w:instrText xml:space="preserve"> PAGEREF _Toc244118946 \h </w:instrText>
         </w:r>
         <w:r>
           <w:rPr>
@@ -489,7 +489,7 @@
           <w14:ligatures w14:val="standardContextual"/>
         </w:rPr>
       </w:pPr>
-      <w:hyperlink w:anchor="_Toc244118399" w:history="1">
+      <w:hyperlink w:anchor="_Toc244118947" w:history="1">
         <w:r>
           <w:rPr>
             <w:rStyle w:val="Hyperlink"/>
@@ -516,7 +516,7 @@
             <w:noProof/>
             <w:webHidden/>
           </w:rPr>
-          <w:instrText xml:space="preserve"> PAGEREF _Toc244118399 \h </w:instrText>
+          <w:instrText xml:space="preserve"> PAGEREF _Toc244118947 \h </w:instrText>
         </w:r>
         <w:r>
           <w:rPr>
@@ -560,7 +560,7 @@
           <w14:ligatures w14:val="standardContextual"/>
         </w:rPr>
       </w:pPr>
-      <w:hyperlink w:anchor="_Toc244118400" w:history="1">
+      <w:hyperlink w:anchor="_Toc244118948" w:history="1">
         <w:r>
           <w:rPr>
             <w:rStyle w:val="Hyperlink"/>
@@ -587,7 +587,7 @@
             <w:noProof/>
             <w:webHidden/>
           </w:rPr>
-          <w:instrText xml:space="preserve"> PAGEREF _Toc244118400 \h </w:instrText>
+          <w:instrText xml:space="preserve"> PAGEREF _Toc244118948 \h </w:instrText>
         </w:r>
         <w:r>
           <w:rPr>
@@ -631,7 +631,7 @@
           <w14:ligatures w14:val="standardContextual"/>
         </w:rPr>
       </w:pPr>
-      <w:hyperlink w:anchor="_Toc244118401" w:history="1">
+      <w:hyperlink w:anchor="_Toc244118949" w:history="1">
         <w:r>
           <w:rPr>
             <w:rStyle w:val="Hyperlink"/>
@@ -658,7 +658,7 @@
             <w:noProof/>
             <w:webHidden/>
           </w:rPr>
-          <w:instrText xml:space="preserve"> PAGEREF _Toc244118401 \h </w:instrText>
+          <w:instrText xml:space="preserve"> PAGEREF _Toc244118949 \h </w:instrText>
         </w:r>
         <w:r>
           <w:rPr>
@@ -702,7 +702,7 @@
           <w14:ligatures w14:val="standardContextual"/>
         </w:rPr>
       </w:pPr>
-      <w:hyperlink w:anchor="_Toc244118402" w:history="1">
+      <w:hyperlink w:anchor="_Toc244118950" w:history="1">
         <w:r>
           <w:rPr>
             <w:rStyle w:val="Hyperlink"/>
@@ -729,7 +729,7 @@
             <w:noProof/>
             <w:webHidden/>
           </w:rPr>
-          <w:instrText xml:space="preserve"> PAGEREF _Toc244118402 \h </w:instrText>
+          <w:instrText xml:space="preserve"> PAGEREF _Toc244118950 \h </w:instrText>
         </w:r>
         <w:r>
           <w:rPr>
@@ -773,7 +773,7 @@
           <w14:ligatures w14:val="standardContextual"/>
         </w:rPr>
       </w:pPr>
-      <w:hyperlink w:anchor="_Toc244118403" w:history="1">
+      <w:hyperlink w:anchor="_Toc244118951" w:history="1">
         <w:r>
           <w:rPr>
             <w:rStyle w:val="Hyperlink"/>
@@ -800,7 +800,7 @@
             <w:noProof/>
             <w:webHidden/>
           </w:rPr>
-          <w:instrText xml:space="preserve"> PAGEREF _Toc244118403 \h </w:instrText>
+          <w:instrText xml:space="preserve"> PAGEREF _Toc244118951 \h </w:instrText>
         </w:r>
         <w:r>
           <w:rPr>
@@ -844,7 +844,7 @@
           <w14:ligatures w14:val="standardContextual"/>
         </w:rPr>
       </w:pPr>
-      <w:hyperlink w:anchor="_Toc244118404" w:history="1">
+      <w:hyperlink w:anchor="_Toc244118952" w:history="1">
         <w:r>
           <w:rPr>
             <w:rStyle w:val="Hyperlink"/>
@@ -871,7 +871,7 @@
             <w:noProof/>
             <w:webHidden/>
           </w:rPr>
-          <w:instrText xml:space="preserve"> PAGEREF _Toc244118404 \h </w:instrText>
+          <w:instrText xml:space="preserve"> PAGEREF _Toc244118952 \h </w:instrText>
         </w:r>
         <w:r>
           <w:rPr>
@@ -915,7 +915,7 @@
           <w14:ligatures w14:val="standardContextual"/>
         </w:rPr>
       </w:pPr>
-      <w:hyperlink w:anchor="_Toc244118405" w:history="1">
+      <w:hyperlink w:anchor="_Toc244118953" w:history="1">
         <w:r>
           <w:rPr>
             <w:rStyle w:val="Hyperlink"/>
@@ -942,7 +942,7 @@
             <w:noProof/>
             <w:webHidden/>
           </w:rPr>
-          <w:instrText xml:space="preserve"> PAGEREF _Toc244118405 \h </w:instrText>
+          <w:instrText xml:space="preserve"> PAGEREF _Toc244118953 \h </w:instrText>
         </w:r>
         <w:r>
           <w:rPr>
@@ -986,7 +986,7 @@
           <w14:ligatures w14:val="standardContextual"/>
         </w:rPr>
       </w:pPr>
-      <w:hyperlink w:anchor="_Toc244118406" w:history="1">
+      <w:hyperlink w:anchor="_Toc244118954" w:history="1">
         <w:r>
           <w:rPr>
             <w:rStyle w:val="Hyperlink"/>
@@ -1013,7 +1013,7 @@
             <w:noProof/>
             <w:webHidden/>
           </w:rPr>
-          <w:instrText xml:space="preserve"> PAGEREF _Toc244118406 \h </w:instrText>
+          <w:instrText xml:space="preserve"> PAGEREF _Toc244118954 \h </w:instrText>
         </w:r>
         <w:r>
           <w:rPr>
@@ -1057,7 +1057,7 @@
           <w14:ligatures w14:val="standardContextual"/>
         </w:rPr>
       </w:pPr>
-      <w:hyperlink w:anchor="_Toc244118407" w:history="1">
+      <w:hyperlink w:anchor="_Toc244118955" w:history="1">
         <w:r>
           <w:rPr>
             <w:rStyle w:val="Hyperlink"/>
@@ -1084,7 +1084,7 @@
             <w:noProof/>
             <w:webHidden/>
           </w:rPr>
-          <w:instrText xml:space="preserve"> PAGEREF _Toc244118407 \h </w:instrText>
+          <w:instrText xml:space="preserve"> PAGEREF _Toc244118955 \h </w:instrText>
         </w:r>
         <w:r>
           <w:rPr>
@@ -1128,7 +1128,7 @@
           <w14:ligatures w14:val="standardContextual"/>
         </w:rPr>
       </w:pPr>
-      <w:hyperlink w:anchor="_Toc244118408" w:history="1">
+      <w:hyperlink w:anchor="_Toc244118956" w:history="1">
         <w:r>
           <w:rPr>
             <w:rStyle w:val="Hyperlink"/>
@@ -1155,7 +1155,7 @@
             <w:noProof/>
             <w:webHidden/>
           </w:rPr>
-          <w:instrText xml:space="preserve"> PAGEREF _Toc244118408 \h </w:instrText>
+          <w:instrText xml:space="preserve"> PAGEREF _Toc244118956 \h </w:instrText>
         </w:r>
         <w:r>
           <w:rPr>
@@ -1199,7 +1199,7 @@
           <w14:ligatures w14:val="standardContextual"/>
         </w:rPr>
       </w:pPr>
-      <w:hyperlink w:anchor="_Toc244118409" w:history="1">
+      <w:hyperlink w:anchor="_Toc244118957" w:history="1">
         <w:r>
           <w:rPr>
             <w:rStyle w:val="Hyperlink"/>
@@ -1226,7 +1226,7 @@
             <w:noProof/>
             <w:webHidden/>
           </w:rPr>
-          <w:instrText xml:space="preserve"> PAGEREF _Toc244118409 \h </w:instrText>
+          <w:instrText xml:space="preserve"> PAGEREF _Toc244118957 \h </w:instrText>
         </w:r>
         <w:r>
           <w:rPr>
@@ -1270,7 +1270,7 @@
           <w14:ligatures w14:val="standardContextual"/>
         </w:rPr>
       </w:pPr>
-      <w:hyperlink w:anchor="_Toc244118410" w:history="1">
+      <w:hyperlink w:anchor="_Toc244118958" w:history="1">
         <w:r>
           <w:rPr>
             <w:rStyle w:val="Hyperlink"/>
@@ -1297,7 +1297,7 @@
             <w:noProof/>
             <w:webHidden/>
           </w:rPr>
-          <w:instrText xml:space="preserve"> PAGEREF _Toc244118410 \h </w:instrText>
+          <w:instrText xml:space="preserve"> PAGEREF _Toc244118958 \h </w:instrText>
         </w:r>
         <w:r>
           <w:rPr>
@@ -1341,7 +1341,7 @@
           <w14:ligatures w14:val="standardContextual"/>
         </w:rPr>
       </w:pPr>
-      <w:hyperlink w:anchor="_Toc244118411" w:history="1">
+      <w:hyperlink w:anchor="_Toc244118959" w:history="1">
         <w:r>
           <w:rPr>
             <w:rStyle w:val="Hyperlink"/>
@@ -1368,7 +1368,7 @@
             <w:noProof/>
             <w:webHidden/>
           </w:rPr>
-          <w:instrText xml:space="preserve"> PAGEREF _Toc244118411 \h </w:instrText>
+          <w:instrText xml:space="preserve"> PAGEREF _Toc244118959 \h </w:instrText>
         </w:r>
         <w:r>
           <w:rPr>
@@ -1412,7 +1412,7 @@
           <w14:ligatures w14:val="standardContextual"/>
         </w:rPr>
       </w:pPr>
-      <w:hyperlink w:anchor="_Toc244118412" w:history="1">
+      <w:hyperlink w:anchor="_Toc244118960" w:history="1">
         <w:r>
           <w:rPr>
             <w:rStyle w:val="Hyperlink"/>
@@ -1439,7 +1439,7 @@
             <w:noProof/>
             <w:webHidden/>
           </w:rPr>
-          <w:instrText xml:space="preserve"> PAGEREF _Toc244118412 \h </w:instrText>
+          <w:instrText xml:space="preserve"> PAGEREF _Toc244118960 \h </w:instrText>
         </w:r>
         <w:r>
           <w:rPr>
@@ -1485,7 +1485,7 @@
           <w14:ligatures w14:val="standardContextual"/>
         </w:rPr>
       </w:pPr>
-      <w:hyperlink w:anchor="_Toc244118413" w:history="1">
+      <w:hyperlink w:anchor="_Toc244118961" w:history="1">
         <w:r>
           <w:rPr>
             <w:rStyle w:val="Hyperlink"/>
@@ -1512,7 +1512,7 @@
             <w:noProof/>
             <w:webHidden/>
           </w:rPr>
-          <w:instrText xml:space="preserve"> PAGEREF _Toc244118413 \h </w:instrText>
+          <w:instrText xml:space="preserve"> PAGEREF _Toc244118961 \h </w:instrText>
         </w:r>
         <w:r>
           <w:rPr>
@@ -1558,7 +1558,7 @@
           <w14:ligatures w14:val="standardContextual"/>
         </w:rPr>
       </w:pPr>
-      <w:hyperlink w:anchor="_Toc244118414" w:history="1">
+      <w:hyperlink w:anchor="_Toc244118962" w:history="1">
         <w:r>
           <w:rPr>
             <w:rStyle w:val="Hyperlink"/>
@@ -1585,7 +1585,7 @@
             <w:noProof/>
             <w:webHidden/>
           </w:rPr>
-          <w:instrText xml:space="preserve"> PAGEREF _Toc244118414 \h </w:instrText>
+          <w:instrText xml:space="preserve"> PAGEREF _Toc244118962 \h </w:instrText>
         </w:r>
         <w:r>
           <w:rPr>
@@ -1631,7 +1631,7 @@
           <w14:ligatures w14:val="standardContextual"/>
         </w:rPr>
       </w:pPr>
-      <w:hyperlink w:anchor="_Toc244118415" w:history="1">
+      <w:hyperlink w:anchor="_Toc244118963" w:history="1">
         <w:r>
           <w:rPr>
             <w:rStyle w:val="Hyperlink"/>
@@ -1658,7 +1658,7 @@
             <w:noProof/>
             <w:webHidden/>
           </w:rPr>
-          <w:instrText xml:space="preserve"> PAGEREF _Toc244118415 \h </w:instrText>
+          <w:instrText xml:space="preserve"> PAGEREF _Toc244118963 \h </w:instrText>
         </w:r>
         <w:r>
           <w:rPr>
@@ -1704,7 +1704,7 @@
           <w14:ligatures w14:val="standardContextual"/>
         </w:rPr>
       </w:pPr>
-      <w:hyperlink w:anchor="_Toc244118416" w:history="1">
+      <w:hyperlink w:anchor="_Toc244118964" w:history="1">
         <w:r>
           <w:rPr>
             <w:rStyle w:val="Hyperlink"/>
@@ -1731,7 +1731,7 @@
             <w:noProof/>
             <w:webHidden/>
           </w:rPr>
-          <w:instrText xml:space="preserve"> PAGEREF _Toc244118416 \h </w:instrText>
+          <w:instrText xml:space="preserve"> PAGEREF _Toc244118964 \h </w:instrText>
         </w:r>
         <w:r>
           <w:rPr>
@@ -1777,7 +1777,7 @@
           <w14:ligatures w14:val="standardContextual"/>
         </w:rPr>
       </w:pPr>
-      <w:hyperlink w:anchor="_Toc244118417" w:history="1">
+      <w:hyperlink w:anchor="_Toc244118965" w:history="1">
         <w:r>
           <w:rPr>
             <w:rStyle w:val="Hyperlink"/>
@@ -1804,7 +1804,7 @@
             <w:noProof/>
             <w:webHidden/>
           </w:rPr>
-          <w:instrText xml:space="preserve"> PAGEREF _Toc244118417 \h </w:instrText>
+          <w:instrText xml:space="preserve"> PAGEREF _Toc244118965 \h </w:instrText>
         </w:r>
         <w:r>
           <w:rPr>
@@ -1850,7 +1850,7 @@
           <w14:ligatures w14:val="standardContextual"/>
         </w:rPr>
       </w:pPr>
-      <w:hyperlink w:anchor="_Toc244118418" w:history="1">
+      <w:hyperlink w:anchor="_Toc244118966" w:history="1">
         <w:r>
           <w:rPr>
             <w:rStyle w:val="Hyperlink"/>
@@ -1877,7 +1877,7 @@
             <w:noProof/>
             <w:webHidden/>
           </w:rPr>
-          <w:instrText xml:space="preserve"> PAGEREF _Toc244118418 \h </w:instrText>
+          <w:instrText xml:space="preserve"> PAGEREF _Toc244118966 \h </w:instrText>
         </w:r>
         <w:r>
           <w:rPr>
@@ -1897,7 +1897,7 @@
             <w:noProof/>
             <w:webHidden/>
           </w:rPr>
-          <w:t>20</w:t>
+          <w:t>22</w:t>
         </w:r>
         <w:r>
           <w:rPr>
@@ -1923,7 +1923,7 @@
           <w14:ligatures w14:val="standardContextual"/>
         </w:rPr>
       </w:pPr>
-      <w:hyperlink w:anchor="_Toc244118419" w:history="1">
+      <w:hyperlink w:anchor="_Toc244118967" w:history="1">
         <w:r>
           <w:rPr>
             <w:rStyle w:val="Hyperlink"/>
@@ -1950,7 +1950,7 @@
             <w:noProof/>
             <w:webHidden/>
           </w:rPr>
-          <w:instrText xml:space="preserve"> PAGEREF _Toc244118419 \h </w:instrText>
+          <w:instrText xml:space="preserve"> PAGEREF _Toc244118967 \h </w:instrText>
         </w:r>
         <w:r>
           <w:rPr>
@@ -1970,7 +1970,7 @@
             <w:noProof/>
             <w:webHidden/>
           </w:rPr>
-          <w:t>21</w:t>
+          <w:t>23</w:t>
         </w:r>
         <w:r>
           <w:rPr>
@@ -1994,7 +1994,7 @@
           <w14:ligatures w14:val="standardContextual"/>
         </w:rPr>
       </w:pPr>
-      <w:hyperlink w:anchor="_Toc244118420" w:history="1">
+      <w:hyperlink w:anchor="_Toc244118968" w:history="1">
         <w:r>
           <w:rPr>
             <w:rStyle w:val="Hyperlink"/>
@@ -2021,7 +2021,7 @@
             <w:noProof/>
             <w:webHidden/>
           </w:rPr>
-          <w:instrText xml:space="preserve"> PAGEREF _Toc244118420 \h </w:instrText>
+          <w:instrText xml:space="preserve"> PAGEREF _Toc244118968 \h </w:instrText>
         </w:r>
         <w:r>
           <w:rPr>
@@ -2041,7 +2041,7 @@
             <w:noProof/>
             <w:webHidden/>
           </w:rPr>
-          <w:t>23</w:t>
+          <w:t>24</w:t>
         </w:r>
         <w:r>
           <w:rPr>
@@ -2065,7 +2065,7 @@
           <w14:ligatures w14:val="standardContextual"/>
         </w:rPr>
       </w:pPr>
-      <w:hyperlink w:anchor="_Toc244118421" w:history="1">
+      <w:hyperlink w:anchor="_Toc244118969" w:history="1">
         <w:r>
           <w:rPr>
             <w:rStyle w:val="Hyperlink"/>
@@ -2092,7 +2092,7 @@
             <w:noProof/>
             <w:webHidden/>
           </w:rPr>
-          <w:instrText xml:space="preserve"> PAGEREF _Toc244118421 \h </w:instrText>
+          <w:instrText xml:space="preserve"> PAGEREF _Toc244118969 \h </w:instrText>
         </w:r>
         <w:r>
           <w:rPr>
@@ -2112,7 +2112,7 @@
             <w:noProof/>
             <w:webHidden/>
           </w:rPr>
-          <w:t>23</w:t>
+          <w:t>25</w:t>
         </w:r>
         <w:r>
           <w:rPr>
@@ -2136,7 +2136,7 @@
           <w14:ligatures w14:val="standardContextual"/>
         </w:rPr>
       </w:pPr>
-      <w:hyperlink w:anchor="_Toc244118422" w:history="1">
+      <w:hyperlink w:anchor="_Toc244118970" w:history="1">
         <w:r>
           <w:rPr>
             <w:rStyle w:val="Hyperlink"/>
@@ -2163,7 +2163,7 @@
             <w:noProof/>
             <w:webHidden/>
           </w:rPr>
-          <w:instrText xml:space="preserve"> PAGEREF _Toc244118422 \h </w:instrText>
+          <w:instrText xml:space="preserve"> PAGEREF _Toc244118970 \h </w:instrText>
         </w:r>
         <w:r>
           <w:rPr>
@@ -2183,7 +2183,7 @@
             <w:noProof/>
             <w:webHidden/>
           </w:rPr>
-          <w:t>23</w:t>
+          <w:t>25</w:t>
         </w:r>
         <w:r>
           <w:rPr>
@@ -2207,7 +2207,7 @@
           <w14:ligatures w14:val="standardContextual"/>
         </w:rPr>
       </w:pPr>
-      <w:hyperlink w:anchor="_Toc244118423" w:history="1">
+      <w:hyperlink w:anchor="_Toc244118971" w:history="1">
         <w:r>
           <w:rPr>
             <w:rStyle w:val="Hyperlink"/>
@@ -2234,7 +2234,7 @@
             <w:noProof/>
             <w:webHidden/>
           </w:rPr>
-          <w:instrText xml:space="preserve"> PAGEREF _Toc244118423 \h </w:instrText>
+          <w:instrText xml:space="preserve"> PAGEREF _Toc244118971 \h </w:instrText>
         </w:r>
         <w:r>
           <w:rPr>
@@ -2254,7 +2254,7 @@
             <w:noProof/>
             <w:webHidden/>
           </w:rPr>
-          <w:t>24</w:t>
+          <w:t>25</w:t>
         </w:r>
         <w:r>
           <w:rPr>
@@ -2278,7 +2278,7 @@
           <w14:ligatures w14:val="standardContextual"/>
         </w:rPr>
       </w:pPr>
-      <w:hyperlink w:anchor="_Toc244118424" w:history="1">
+      <w:hyperlink w:anchor="_Toc244118972" w:history="1">
         <w:r>
           <w:rPr>
             <w:rStyle w:val="Hyperlink"/>
@@ -2305,7 +2305,7 @@
             <w:noProof/>
             <w:webHidden/>
           </w:rPr>
-          <w:instrText xml:space="preserve"> PAGEREF _Toc244118424 \h </w:instrText>
+          <w:instrText xml:space="preserve"> PAGEREF _Toc244118972 \h </w:instrText>
         </w:r>
         <w:r>
           <w:rPr>
@@ -2325,7 +2325,7 @@
             <w:noProof/>
             <w:webHidden/>
           </w:rPr>
-          <w:t>24</w:t>
+          <w:t>25</w:t>
         </w:r>
         <w:r>
           <w:rPr>
@@ -2349,7 +2349,7 @@
           <w14:ligatures w14:val="standardContextual"/>
         </w:rPr>
       </w:pPr>
-      <w:hyperlink w:anchor="_Toc244118425" w:history="1">
+      <w:hyperlink w:anchor="_Toc244118973" w:history="1">
         <w:r>
           <w:rPr>
             <w:rStyle w:val="Hyperlink"/>
@@ -2376,7 +2376,7 @@
             <w:noProof/>
             <w:webHidden/>
           </w:rPr>
-          <w:instrText xml:space="preserve"> PAGEREF _Toc244118425 \h </w:instrText>
+          <w:instrText xml:space="preserve"> PAGEREF _Toc244118973 \h </w:instrText>
         </w:r>
         <w:r>
           <w:rPr>
@@ -2396,7 +2396,7 @@
             <w:noProof/>
             <w:webHidden/>
           </w:rPr>
-          <w:t>24</w:t>
+          <w:t>26</w:t>
         </w:r>
         <w:r>
           <w:rPr>
@@ -2420,7 +2420,7 @@
           <w14:ligatures w14:val="standardContextual"/>
         </w:rPr>
       </w:pPr>
-      <w:hyperlink w:anchor="_Toc244118426" w:history="1">
+      <w:hyperlink w:anchor="_Toc244118974" w:history="1">
         <w:r>
           <w:rPr>
             <w:rStyle w:val="Hyperlink"/>
@@ -2447,7 +2447,7 @@
             <w:noProof/>
             <w:webHidden/>
           </w:rPr>
-          <w:instrText xml:space="preserve"> PAGEREF _Toc244118426 \h </w:instrText>
+          <w:instrText xml:space="preserve"> PAGEREF _Toc244118974 \h </w:instrText>
         </w:r>
         <w:r>
           <w:rPr>
@@ -2467,7 +2467,7 @@
             <w:noProof/>
             <w:webHidden/>
           </w:rPr>
-          <w:t>25</w:t>
+          <w:t>27</w:t>
         </w:r>
         <w:r>
           <w:rPr>
@@ -2491,7 +2491,7 @@
           <w14:ligatures w14:val="standardContextual"/>
         </w:rPr>
       </w:pPr>
-      <w:hyperlink w:anchor="_Toc244118427" w:history="1">
+      <w:hyperlink w:anchor="_Toc244118975" w:history="1">
         <w:r>
           <w:rPr>
             <w:rStyle w:val="Hyperlink"/>
@@ -2518,7 +2518,7 @@
             <w:noProof/>
             <w:webHidden/>
           </w:rPr>
-          <w:instrText xml:space="preserve"> PAGEREF _Toc244118427 \h </w:instrText>
+          <w:instrText xml:space="preserve"> PAGEREF _Toc244118975 \h </w:instrText>
         </w:r>
         <w:r>
           <w:rPr>
@@ -2538,7 +2538,7 @@
             <w:noProof/>
             <w:webHidden/>
           </w:rPr>
-          <w:t>26</w:t>
+          <w:t>28</w:t>
         </w:r>
         <w:r>
           <w:rPr>
@@ -2562,7 +2562,7 @@
         <w:pStyle w:val="Heading1"/>
         <w:pageBreakBefore/>
       </w:pPr>
-      <w:bookmarkStart w:id="0" w:name="_Toc244118396"/>
+      <w:bookmarkStart w:id="0" w:name="_Toc244118944"/>
       <w:r>
         <w:lastRenderedPageBreak/>
         <w:t>1. Introduction</w:t>
@@ -2597,7 +2597,7 @@
       <w:pPr>
         <w:pStyle w:val="Heading2"/>
       </w:pPr>
-      <w:bookmarkStart w:id="1" w:name="_Toc244118397"/>
+      <w:bookmarkStart w:id="1" w:name="_Toc244118945"/>
       <w:r>
         <w:t>1.1 Practical Applications</w:t>
       </w:r>
@@ -2623,7 +2623,7 @@
       <w:pPr>
         <w:pStyle w:val="Heading1"/>
       </w:pPr>
-      <w:bookmarkStart w:id="2" w:name="_Toc244118398"/>
+      <w:bookmarkStart w:id="2" w:name="_Toc244118946"/>
       <w:r>
         <w:t>2. Problem Statement</w:t>
       </w:r>
@@ -2649,7 +2649,7 @@
       <w:pPr>
         <w:pStyle w:val="Heading1"/>
       </w:pPr>
-      <w:bookmarkStart w:id="3" w:name="_Toc244118399"/>
+      <w:bookmarkStart w:id="3" w:name="_Toc244118947"/>
       <w:r>
         <w:lastRenderedPageBreak/>
         <w:t>3. Objectives</w:t>
@@ -2716,7 +2716,7 @@
       <w:pPr>
         <w:pStyle w:val="Heading1"/>
       </w:pPr>
-      <w:bookmarkStart w:id="4" w:name="_Toc244118400"/>
+      <w:bookmarkStart w:id="4" w:name="_Toc244118948"/>
       <w:r>
         <w:t>4. Literature Review and Existing System</w:t>
       </w:r>
@@ -3635,7 +3635,7 @@
       <w:pPr>
         <w:pStyle w:val="Heading1"/>
       </w:pPr>
-      <w:bookmarkStart w:id="5" w:name="_Toc244118401"/>
+      <w:bookmarkStart w:id="5" w:name="_Toc244118949"/>
       <w:r>
         <w:t>5. Abstract</w:t>
       </w:r>
@@ -3659,7 +3659,7 @@
       <w:pPr>
         <w:pStyle w:val="Heading1"/>
       </w:pPr>
-      <w:bookmarkStart w:id="6" w:name="_Toc244118402"/>
+      <w:bookmarkStart w:id="6" w:name="_Toc244118950"/>
       <w:r>
         <w:t>6. Workflow of the Proposed Project work and System Architecture</w:t>
       </w:r>
@@ -4114,7 +4114,7 @@
         </w:rPr>
         <w:lastRenderedPageBreak/>
         <w:drawing>
-          <wp:inline distT="0" distB="0" distL="0" distR="0" wp14:anchorId="57E9C709" wp14:editId="3E8588D3">
+          <wp:inline distT="0" distB="0" distL="0" distR="0" wp14:anchorId="621C1B8F" wp14:editId="6B5A26E5">
             <wp:extent cx="5577840" cy="3022829"/>
             <wp:effectExtent l="0" t="0" r="0" b="0"/>
             <wp:docPr id="2" name="Picture 2" descr="Control and data paths in FaultNet. The workbench and live proxy have independent fault configurations; replies return through the same proxy path."/>
@@ -4174,7 +4174,7 @@
       <w:pPr>
         <w:pStyle w:val="Heading2"/>
       </w:pPr>
-      <w:bookmarkStart w:id="7" w:name="_Toc244118403"/>
+      <w:bookmarkStart w:id="7" w:name="_Toc244118951"/>
       <w:r>
         <w:t>6.1 Dashboard Roles and Separation</w:t>
       </w:r>
@@ -4689,7 +4689,7 @@
       <w:pPr>
         <w:pStyle w:val="Heading2"/>
       </w:pPr>
-      <w:bookmarkStart w:id="8" w:name="_Toc244118404"/>
+      <w:bookmarkStart w:id="8" w:name="_Toc244118952"/>
       <w:r>
         <w:lastRenderedPageBreak/>
         <w:t>6.2 Workbench Functions and Fault Mechanisms</w:t>
@@ -5071,7 +5071,7 @@
       <w:pPr>
         <w:pStyle w:val="Heading2"/>
       </w:pPr>
-      <w:bookmarkStart w:id="9" w:name="_Toc244118405"/>
+      <w:bookmarkStart w:id="9" w:name="_Toc244118953"/>
       <w:r>
         <w:t>6.3 Live Proxy Cockpit Functions</w:t>
       </w:r>
@@ -5506,7 +5506,7 @@
       <w:pPr>
         <w:pStyle w:val="Heading1"/>
       </w:pPr>
-      <w:bookmarkStart w:id="10" w:name="_Toc244118406"/>
+      <w:bookmarkStart w:id="10" w:name="_Toc244118954"/>
       <w:r>
         <w:t>7. Contribution of Individual Team Member</w:t>
       </w:r>
@@ -5796,7 +5796,7 @@
       <w:pPr>
         <w:pStyle w:val="Heading1"/>
       </w:pPr>
-      <w:bookmarkStart w:id="11" w:name="_Toc244118407"/>
+      <w:bookmarkStart w:id="11" w:name="_Toc244118955"/>
       <w:r>
         <w:t>8. Modules Explanation</w:t>
       </w:r>
@@ -6475,7 +6475,7 @@
       <w:pPr>
         <w:pStyle w:val="Heading1"/>
       </w:pPr>
-      <w:bookmarkStart w:id="12" w:name="_Toc244118408"/>
+      <w:bookmarkStart w:id="12" w:name="_Toc244118956"/>
       <w:r>
         <w:t>9. Project Implementation</w:t>
       </w:r>
@@ -6485,7 +6485,7 @@
       <w:pPr>
         <w:pStyle w:val="Heading2"/>
       </w:pPr>
-      <w:bookmarkStart w:id="13" w:name="_Toc244118409"/>
+      <w:bookmarkStart w:id="13" w:name="_Toc244118957"/>
       <w:r>
         <w:t>9.1 Experimental Setup with Hardware and Software Requirements</w:t>
       </w:r>
@@ -7068,7 +7068,7 @@
       <w:pPr>
         <w:pStyle w:val="Heading2"/>
       </w:pPr>
-      <w:bookmarkStart w:id="14" w:name="_Toc244118410"/>
+      <w:bookmarkStart w:id="14" w:name="_Toc244118958"/>
       <w:r>
         <w:t>9.2 Test Cases</w:t>
       </w:r>
@@ -7689,7 +7689,7 @@
       <w:pPr>
         <w:pStyle w:val="Heading2"/>
       </w:pPr>
-      <w:bookmarkStart w:id="15" w:name="_Toc244118411"/>
+      <w:bookmarkStart w:id="15" w:name="_Toc244118959"/>
       <w:r>
         <w:t>9.3 Results of Execution and Screenshots</w:t>
       </w:r>
@@ -7725,7 +7725,7 @@
         </w:rPr>
         <w:lastRenderedPageBreak/>
         <w:drawing>
-          <wp:inline distT="0" distB="0" distL="0" distR="0" wp14:anchorId="23DED75A" wp14:editId="36F86339">
+          <wp:inline distT="0" distB="0" distL="0" distR="0" wp14:anchorId="7C93193F" wp14:editId="323C820B">
             <wp:extent cx="5577840" cy="3487618"/>
             <wp:effectExtent l="0" t="0" r="0" b="0"/>
             <wp:docPr id="3" name="Picture 3" descr="Representative workbench interface showing settings, phase comparisons, successful timing and recovery evidence. Displayed example values are not the repeated-study aggregate."/>
@@ -9177,7 +9177,7 @@
       <w:pPr>
         <w:pStyle w:val="Heading2"/>
       </w:pPr>
-      <w:bookmarkStart w:id="16" w:name="_Toc244118412"/>
+      <w:bookmarkStart w:id="16" w:name="_Toc244118960"/>
       <w:r>
         <w:lastRenderedPageBreak/>
         <w:t>9.4 Performance Analysis and Comparison of Methods</w:t>
@@ -9188,7 +9188,7 @@
       <w:pPr>
         <w:pStyle w:val="Heading3"/>
       </w:pPr>
-      <w:bookmarkStart w:id="17" w:name="_Toc244118413"/>
+      <w:bookmarkStart w:id="17" w:name="_Toc244118961"/>
       <w:r>
         <w:t>9.4.1 Delay Calibration and Distribution</w:t>
       </w:r>
@@ -9744,7 +9744,7 @@
           <w:noProof/>
         </w:rPr>
         <w:drawing>
-          <wp:inline distT="0" distB="0" distL="0" distR="0" wp14:anchorId="72035F24" wp14:editId="0665D554">
+          <wp:inline distT="0" distB="0" distL="0" distR="0" wp14:anchorId="5655B916" wp14:editId="31AA59B5">
             <wp:extent cx="5577840" cy="3003728"/>
             <wp:effectExtent l="0" t="0" r="0" b="0"/>
             <wp:docPr id="4" name="Picture 4" descr="Configured delay versus paired measured increase. Error bars are exploratory bootstrap intervals across ten runs."/>
@@ -9814,7 +9814,7 @@
         </w:rPr>
         <w:lastRenderedPageBreak/>
         <w:drawing>
-          <wp:inline distT="0" distB="0" distL="0" distR="0" wp14:anchorId="0BB5A4B3" wp14:editId="527C2ECF">
+          <wp:inline distT="0" distB="0" distL="0" distR="0" wp14:anchorId="6F4050FD" wp14:editId="116FEAC1">
             <wp:extent cx="5577840" cy="3001801"/>
             <wp:effectExtent l="0" t="0" r="0" b="0"/>
             <wp:docPr id="5" name="Picture 5" descr="Empirical distributions of successful faulty response times; 50 observations per configured delay. Curves show separation and within-condition variation."/>
@@ -9874,7 +9874,7 @@
       <w:pPr>
         <w:pStyle w:val="Heading3"/>
       </w:pPr>
-      <w:bookmarkStart w:id="18" w:name="_Toc244118414"/>
+      <w:bookmarkStart w:id="18" w:name="_Toc244118962"/>
       <w:r>
         <w:t>9.4.2 Bandwidth Shaping and Rate Attainment</w:t>
       </w:r>
@@ -10428,7 +10428,7 @@
         </w:rPr>
         <w:lastRenderedPageBreak/>
         <w:drawing>
-          <wp:inline distT="0" distB="0" distL="0" distR="0" wp14:anchorId="011C957E" wp14:editId="409FB187">
+          <wp:inline distT="0" distB="0" distL="0" distR="0" wp14:anchorId="0D8DB6DF" wp14:editId="10AD4ACD">
             <wp:extent cx="5577840" cy="3001801"/>
             <wp:effectExtent l="0" t="0" r="0" b="0"/>
             <wp:docPr id="6" name="Picture 6" descr="Measured whole-request goodput versus configured restriction for the same 64 KiB payload."/>
@@ -10499,7 +10499,7 @@
       <w:pPr>
         <w:pStyle w:val="Heading3"/>
       </w:pPr>
-      <w:bookmarkStart w:id="19" w:name="_Toc244118415"/>
+      <w:bookmarkStart w:id="19" w:name="_Toc244118963"/>
       <w:r>
         <w:t>9.4.3 Timeout Tradeoff and Failure Outcomes</w:t>
       </w:r>
@@ -10515,7 +10515,7 @@
           <w:noProof/>
         </w:rPr>
         <w:drawing>
-          <wp:inline distT="0" distB="0" distL="0" distR="0" wp14:anchorId="496A6F12" wp14:editId="1333E17B">
+          <wp:inline distT="0" distB="0" distL="0" distR="0" wp14:anchorId="631B6061" wp14:editId="2C4D5523">
             <wp:extent cx="5577840" cy="2833643"/>
             <wp:effectExtent l="0" t="0" r="0" b="0"/>
             <wp:docPr id="7" name="Picture 7" descr="Fixed 1,000 ms injected delay with two client deadlines. The duration panel distinguishes failed waiting time from successful response latency."/>
@@ -10584,7 +10584,7 @@
       <w:pPr>
         <w:pStyle w:val="Heading3"/>
       </w:pPr>
-      <w:bookmarkStart w:id="20" w:name="_Toc244118416"/>
+      <w:bookmarkStart w:id="20" w:name="_Toc244118964"/>
       <w:r>
         <w:t>9.4.4 Interception Cost and Recovery</w:t>
       </w:r>
@@ -10608,7 +10608,7 @@
           <w:noProof/>
         </w:rPr>
         <w:drawing>
-          <wp:inline distT="0" distB="0" distL="0" distR="0" wp14:anchorId="485DDA4A" wp14:editId="538C21F9">
+          <wp:inline distT="0" distB="0" distL="0" distR="0" wp14:anchorId="2DC7E8C5" wp14:editId="6939AB39">
             <wp:extent cx="5577840" cy="3087669"/>
             <wp:effectExtent l="0" t="0" r="0" b="0"/>
             <wp:docPr id="8" name="Picture 8" descr="Baseline and recovered successful response times for selected conditions; Table 13 covers all ten. Recovery phase medians and confirmation duration are distinct metrics."/>
@@ -11797,7 +11797,7 @@
       <w:pPr>
         <w:pStyle w:val="Heading3"/>
       </w:pPr>
-      <w:bookmarkStart w:id="21" w:name="_Toc244118417"/>
+      <w:bookmarkStart w:id="21" w:name="_Toc244118965"/>
       <w:r>
         <w:t>9.4.5 Live Proxy Evaluation</w:t>
       </w:r>
@@ -11813,10 +11813,140 @@
           <w:noProof/>
         </w:rPr>
         <w:drawing>
-          <wp:inline distT="0" distB="0" distL="0" distR="0" wp14:anchorId="4200262C" wp14:editId="1AC54239">
+          <wp:inline distT="0" distB="0" distL="0" distR="0" wp14:anchorId="646AABDB" wp14:editId="6B4FDDF4">
+            <wp:extent cx="5577840" cy="2606162"/>
+            <wp:effectExtent l="0" t="0" r="0" b="0"/>
+            <wp:docPr id="9" name="Picture 9" descr="Live proxy cockpit showing applied settings and its recent-traffic monitor. This interface snapshot is separate from the controlled evaluation tables."/>
+            <wp:cNvGraphicFramePr>
+              <a:graphicFrameLocks xmlns:a="http://schemas.openxmlformats.org/drawingml/2006/main" noChangeAspect="1"/>
+            </wp:cNvGraphicFramePr>
+            <a:graphic xmlns:a="http://schemas.openxmlformats.org/drawingml/2006/main">
+              <a:graphicData uri="http://schemas.openxmlformats.org/drawingml/2006/picture">
+                <pic:pic xmlns:pic="http://schemas.openxmlformats.org/drawingml/2006/picture">
+                  <pic:nvPicPr>
+                    <pic:cNvPr id="0" name="live-cockpit.png"/>
+                    <pic:cNvPicPr/>
+                  </pic:nvPicPr>
+                  <pic:blipFill>
+                    <a:blip r:embed="rId18"/>
+                    <a:stretch>
+                      <a:fillRect/>
+                    </a:stretch>
+                  </pic:blipFill>
+                  <pic:spPr>
+                    <a:xfrm>
+                      <a:off x="0" y="0"/>
+                      <a:ext cx="5577840" cy="2606162"/>
+                    </a:xfrm>
+                    <a:prstGeom prst="rect">
+                      <a:avLst/>
+                    </a:prstGeom>
+                  </pic:spPr>
+                </pic:pic>
+              </a:graphicData>
+            </a:graphic>
+          </wp:inline>
+        </w:drawing>
+      </w:r>
+    </w:p>
+    <w:p>
+      <w:pPr>
+        <w:pStyle w:val="Caption"/>
+        <w:jc w:val="center"/>
+      </w:pPr>
+      <w:r>
+        <w:rPr>
+          <w:b w:val="0"/>
+        </w:rPr>
+        <w:t>Figure 8. Live proxy cockpit showing applied settings and its recent-traffic monitor. This interface snapshot is separate from the controlled evaluation tables.</w:t>
+      </w:r>
+    </w:p>
+    <w:p>
+      <w:pPr>
+        <w:jc w:val="both"/>
+      </w:pPr>
+      <w:r>
+        <w:t>The cockpit snapshot shows 50 finished requests, 49 marked altered, 30 error/cancel outcomes and a 29.9 ms displayed median. These values summarize the latest monitor window, including earlier faulted requests; zero delay/rate settings do not erase that history. Reset removes active effects, while Clear monitor clears the visible history. The rolling monitor values are distinct from the eight-condition live study and the workbench's successful-response statistics. A display of error/cancel outcomes is not a</w:t>
+      </w:r>
+      <w:r>
+        <w:t>n IP packet-loss measurement.</w:t>
+      </w:r>
+    </w:p>
+    <w:p>
+      <w:pPr>
+        <w:keepNext/>
+        <w:jc w:val="center"/>
+      </w:pPr>
+      <w:r>
+        <w:rPr>
+          <w:noProof/>
+        </w:rPr>
+        <w:lastRenderedPageBreak/>
+        <w:drawing>
+          <wp:inline distT="0" distB="0" distL="0" distR="0" wp14:anchorId="7202BAF8" wp14:editId="6DCBBA7F">
+            <wp:extent cx="5577840" cy="6008153"/>
+            <wp:effectExtent l="0" t="0" r="0" b="0"/>
+            <wp:docPr id="10" name="Picture 10" descr="Enlarged monitor detail from the same cockpit screenshot. The latest 50 finished requests remain visible after faults are reset; counts are not the repeated-study totals."/>
+            <wp:cNvGraphicFramePr>
+              <a:graphicFrameLocks xmlns:a="http://schemas.openxmlformats.org/drawingml/2006/main" noChangeAspect="1"/>
+            </wp:cNvGraphicFramePr>
+            <a:graphic xmlns:a="http://schemas.openxmlformats.org/drawingml/2006/main">
+              <a:graphicData uri="http://schemas.openxmlformats.org/drawingml/2006/picture">
+                <pic:pic xmlns:pic="http://schemas.openxmlformats.org/drawingml/2006/picture">
+                  <pic:nvPicPr>
+                    <pic:cNvPr id="0" name="live-cockpit.png"/>
+                    <pic:cNvPicPr/>
+                  </pic:nvPicPr>
+                  <pic:blipFill>
+                    <a:blip r:embed="rId18"/>
+                    <a:srcRect l="63400" t="15621"/>
+                    <a:stretch>
+                      <a:fillRect/>
+                    </a:stretch>
+                  </pic:blipFill>
+                  <pic:spPr>
+                    <a:xfrm>
+                      <a:off x="0" y="0"/>
+                      <a:ext cx="5577840" cy="6008153"/>
+                    </a:xfrm>
+                    <a:prstGeom prst="rect">
+                      <a:avLst/>
+                    </a:prstGeom>
+                  </pic:spPr>
+                </pic:pic>
+              </a:graphicData>
+            </a:graphic>
+          </wp:inline>
+        </w:drawing>
+      </w:r>
+    </w:p>
+    <w:p>
+      <w:pPr>
+        <w:pStyle w:val="Caption"/>
+        <w:jc w:val="center"/>
+      </w:pPr>
+      <w:r>
+        <w:rPr>
+          <w:b w:val="0"/>
+        </w:rPr>
+        <w:t>Figure 9. Enlarged monitor detail from the same cockpit screenshot. The latest 50 finished requests remain visible after faults are reset; counts are not the repeated-study totals.</w:t>
+      </w:r>
+    </w:p>
+    <w:p>
+      <w:pPr>
+        <w:keepNext/>
+        <w:jc w:val="center"/>
+      </w:pPr>
+      <w:r>
+        <w:rPr>
+          <w:noProof/>
+        </w:rPr>
+        <w:lastRenderedPageBreak/>
+        <w:drawing>
+          <wp:inline distT="0" distB="0" distL="0" distR="0" wp14:anchorId="3BBE8476" wp14:editId="16EC731E">
             <wp:extent cx="5577840" cy="2915933"/>
             <wp:effectExtent l="0" t="0" r="0" b="0"/>
-            <wp:docPr id="9" name="Picture 9" descr="Individual live attempt durations under normal, delayed, jittered and rate-restricted configurations; ten observations per condition, with black median markers."/>
+            <wp:docPr id="11" name="Picture 11" descr="Individual live attempt durations under normal, delayed, jittered and rate-restricted configurations; ten observations per condition, with black median markers."/>
             <wp:cNvGraphicFramePr>
               <a:graphicFrameLocks xmlns:a="http://schemas.openxmlformats.org/drawingml/2006/main" noChangeAspect="1"/>
             </wp:cNvGraphicFramePr>
@@ -11828,7 +11958,7 @@
                     <pic:cNvPicPr/>
                   </pic:nvPicPr>
                   <pic:blipFill>
-                    <a:blip r:embed="rId18"/>
+                    <a:blip r:embed="rId19"/>
                     <a:stretch>
                       <a:fillRect/>
                     </a:stretch>
@@ -11858,7 +11988,7 @@
         <w:rPr>
           <w:b w:val="0"/>
         </w:rPr>
-        <w:t>Figure 8. Individual live attempt durations under normal, delayed, jittered and rate-restricted configurations; ten observations per condition, with black median markers.</w:t>
+        <w:t>Figure 10. Individual live attempt durations under normal, delayed, jittered and rate-restricted configurations; ten observations per condition, with black median markers.</w:t>
       </w:r>
     </w:p>
     <w:p>
@@ -12899,7 +13029,6 @@
               <w:rPr>
                 <w:sz w:val="20"/>
               </w:rPr>
-              <w:lastRenderedPageBreak/>
               <w:t>mock</w:t>
             </w:r>
           </w:p>
@@ -13024,8 +13153,9 @@
       <w:pPr>
         <w:pStyle w:val="Heading3"/>
       </w:pPr>
-      <w:bookmarkStart w:id="22" w:name="_Toc244118418"/>
+      <w:bookmarkStart w:id="22" w:name="_Toc244118966"/>
       <w:r>
+        <w:lastRenderedPageBreak/>
         <w:t>9.4.6 Packet Evidence and Timing Correlation</w:t>
       </w:r>
       <w:bookmarkEnd w:id="22"/>
@@ -13497,12 +13627,11 @@
         <w:rPr>
           <w:noProof/>
         </w:rPr>
-        <w:lastRenderedPageBreak/>
         <w:drawing>
-          <wp:inline distT="0" distB="0" distL="0" distR="0" wp14:anchorId="1C8A4F30" wp14:editId="010CAD0C">
+          <wp:inline distT="0" distB="0" distL="0" distR="0" wp14:anchorId="08090DFC" wp14:editId="5E6A25FB">
             <wp:extent cx="5577840" cy="3172486"/>
             <wp:effectExtent l="0" t="0" r="0" b="0"/>
-            <wp:docPr id="10" name="Picture 10" descr="Measured request and response timing extracted with TShark from the loopback capture. This is an analytical packet view, not a simulated Wireshark screenshot."/>
+            <wp:docPr id="12" name="Picture 12" descr="Measured request and response timing extracted with TShark from the loopback capture. This is an analytical packet view, not a simulated Wireshark screenshot."/>
             <wp:cNvGraphicFramePr>
               <a:graphicFrameLocks xmlns:a="http://schemas.openxmlformats.org/drawingml/2006/main" noChangeAspect="1"/>
             </wp:cNvGraphicFramePr>
@@ -13514,7 +13643,7 @@
                     <pic:cNvPicPr/>
                   </pic:nvPicPr>
                   <pic:blipFill>
-                    <a:blip r:embed="rId19"/>
+                    <a:blip r:embed="rId20"/>
                     <a:stretch>
                       <a:fillRect/>
                     </a:stretch>
@@ -13544,7 +13673,7 @@
         <w:rPr>
           <w:b w:val="0"/>
         </w:rPr>
-        <w:t>Figure 9. Measured request and response timing extracted with TShark from the loopback capture. This is an analytical packet view, not a simulated Wireshark screenshot.</w:t>
+        <w:t>Figure 11. Measured request and response timing extracted with TShark from the loopback capture. This is an analytical packet view, not a simulated Wireshark screenshot.</w:t>
       </w:r>
     </w:p>
     <w:p>
@@ -13562,8 +13691,9 @@
       <w:pPr>
         <w:pStyle w:val="Heading3"/>
       </w:pPr>
-      <w:bookmarkStart w:id="23" w:name="_Toc244118419"/>
+      <w:bookmarkStart w:id="23" w:name="_Toc244118967"/>
       <w:r>
+        <w:lastRenderedPageBreak/>
         <w:t>9.4.7 Routing Comparison in Packet Tracer</w:t>
       </w:r>
       <w:bookmarkEnd w:id="23"/>
@@ -13578,10 +13708,10 @@
           <w:noProof/>
         </w:rPr>
         <w:drawing>
-          <wp:inline distT="0" distB="0" distL="0" distR="0" wp14:anchorId="5E575935" wp14:editId="58063AC4">
+          <wp:inline distT="0" distB="0" distL="0" distR="0" wp14:anchorId="293FF92F" wp14:editId="1647423D">
             <wp:extent cx="5577840" cy="2824086"/>
             <wp:effectExtent l="0" t="0" r="0" b="0"/>
-            <wp:docPr id="11" name="Picture 11" descr="Reviewed Packet Tracer topology with three routers, three switches and six PCs. The router triangle offers an alternate R1–R3–R2 path."/>
+            <wp:docPr id="13" name="Picture 13" descr="Reviewed Packet Tracer topology with three routers, three switches and six PCs. The router triangle offers an alternate R1–R3–R2 path."/>
             <wp:cNvGraphicFramePr>
               <a:graphicFrameLocks xmlns:a="http://schemas.openxmlformats.org/drawingml/2006/main" noChangeAspect="1"/>
             </wp:cNvGraphicFramePr>
@@ -13593,7 +13723,7 @@
                     <pic:cNvPicPr/>
                   </pic:nvPicPr>
                   <pic:blipFill>
-                    <a:blip r:embed="rId20"/>
+                    <a:blip r:embed="rId21"/>
                     <a:stretch>
                       <a:fillRect/>
                     </a:stretch>
@@ -13623,7 +13753,7 @@
         <w:rPr>
           <w:b w:val="0"/>
         </w:rPr>
-        <w:t>Figure 10. Reviewed Packet Tracer topology with three routers, three switches and six PCs. The router triangle offers an alternate R1–R3–R2 path.</w:t>
+        <w:t>Figure 12. Reviewed Packet Tracer topology with three routers, three switches and six PCs. The router triangle offers an alternate R1–R3–R2 path.</w:t>
       </w:r>
     </w:p>
     <w:p>
@@ -13631,7 +13761,6 @@
         <w:jc w:val="both"/>
       </w:pPr>
       <w:r>
-        <w:lastRenderedPageBreak/>
         <w:t>The reviewed lab workload sends PC1 (192.168.0.2) to PC3 (192.168.1.2). R1 GigabitEthernet0/0 is disabled to remove the direct R1–R2 path. Stable ping batches and the R1 route table are inspected after convergence, and the interface is restored afterward. These simulator observations are a separately reviewed evidence set, not repetitions of the HTTP experiment dataset.</w:t>
       </w:r>
     </w:p>
@@ -14094,11 +14223,12 @@
         <w:rPr>
           <w:noProof/>
         </w:rPr>
+        <w:lastRenderedPageBreak/>
         <w:drawing>
-          <wp:inline distT="0" distB="0" distL="0" distR="0" wp14:anchorId="020967D2" wp14:editId="3DE08502">
+          <wp:inline distT="0" distB="0" distL="0" distR="0" wp14:anchorId="46C4E08C" wp14:editId="09E73228">
             <wp:extent cx="5577840" cy="2915933"/>
             <wp:effectExtent l="0" t="0" r="0" b="0"/>
-            <wp:docPr id="12" name="Picture 12" descr="Descriptive reachability comparison of reviewed four-ping batches. Bars are observations of this topology, not reliability estimates for each protocol."/>
+            <wp:docPr id="14" name="Picture 14" descr="Descriptive reachability comparison of reviewed four-ping batches. Bars are observations of this topology, not reliability estimates for each protocol."/>
             <wp:cNvGraphicFramePr>
               <a:graphicFrameLocks xmlns:a="http://schemas.openxmlformats.org/drawingml/2006/main" noChangeAspect="1"/>
             </wp:cNvGraphicFramePr>
@@ -14110,7 +14240,7 @@
                     <pic:cNvPicPr/>
                   </pic:nvPicPr>
                   <pic:blipFill>
-                    <a:blip r:embed="rId21"/>
+                    <a:blip r:embed="rId22"/>
                     <a:stretch>
                       <a:fillRect/>
                     </a:stretch>
@@ -14140,7 +14270,7 @@
         <w:rPr>
           <w:b w:val="0"/>
         </w:rPr>
-        <w:t>Figure 11. Descriptive reachability comparison of reviewed four-ping batches. Bars are observations of this topology, not reliability estimates for each protocol.</w:t>
+        <w:t>Figure 13. Descriptive reachability comparison of reviewed four-ping batches. Bars are observations of this topology, not reliability estimates for each protocol.</w:t>
       </w:r>
     </w:p>
     <w:p>
@@ -14216,7 +14346,6 @@
         <w:jc w:val="both"/>
       </w:pPr>
       <w:r>
-        <w:lastRenderedPageBreak/>
         <w:t>Dynamic routing preserved reachability in the settled fault state of this topology, while the deliberately unprotected static configuration did not. Static routing can be configured with backup routes; the result is not a universal failure of static routing. Warm-up and restoration batches included transient losses. Fast Forward Time advanced the simulator, so the records do not support wall-clock convergence comparisons or a claim that OSPF was faster than RIP. Route selection, next hop and reachability es</w:t>
       </w:r>
       <w:r>
@@ -14227,7 +14356,7 @@
       <w:pPr>
         <w:pStyle w:val="Heading2"/>
       </w:pPr>
-      <w:bookmarkStart w:id="24" w:name="_Toc244118420"/>
+      <w:bookmarkStart w:id="24" w:name="_Toc244118968"/>
       <w:r>
         <w:t>9.5 Critical Evaluation and Optimization</w:t>
       </w:r>
@@ -14254,6 +14383,7 @@
         <w:jc w:val="both"/>
       </w:pPr>
       <w:r>
+        <w:lastRenderedPageBreak/>
         <w:t>The current 1 KiB scheduling method could be evaluated against adaptive chunk sizes or batching at higher rates. A sound optimization study would hold the payload and target rate constant, compare attained goodput and CPU use, and retain cancellation/backpressure behavior. That is an engineering implication of the measured pacing limitation, not an implemented improvement claimed by this report.</w:t>
       </w:r>
     </w:p>
@@ -14261,7 +14391,7 @@
       <w:pPr>
         <w:pStyle w:val="Heading1"/>
       </w:pPr>
-      <w:bookmarkStart w:id="25" w:name="_Toc244118421"/>
+      <w:bookmarkStart w:id="25" w:name="_Toc244118969"/>
       <w:r>
         <w:t>10. Results and Discussion</w:t>
       </w:r>
@@ -14271,7 +14401,7 @@
       <w:pPr>
         <w:pStyle w:val="Heading2"/>
       </w:pPr>
-      <w:bookmarkStart w:id="26" w:name="_Toc244118422"/>
+      <w:bookmarkStart w:id="26" w:name="_Toc244118970"/>
       <w:r>
         <w:t>10.1 Findings and Inferences</w:t>
       </w:r>
@@ -14313,9 +14443,8 @@
       <w:pPr>
         <w:pStyle w:val="Heading2"/>
       </w:pPr>
-      <w:bookmarkStart w:id="27" w:name="_Toc244118423"/>
+      <w:bookmarkStart w:id="27" w:name="_Toc244118971"/>
       <w:r>
-        <w:lastRenderedPageBreak/>
         <w:t>10.2 Innovation Novelty and Evidence</w:t>
       </w:r>
       <w:bookmarkEnd w:id="27"/>
@@ -14343,7 +14472,7 @@
       <w:pPr>
         <w:pStyle w:val="Heading1"/>
       </w:pPr>
-      <w:bookmarkStart w:id="28" w:name="_Toc244118424"/>
+      <w:bookmarkStart w:id="28" w:name="_Toc244118972"/>
       <w:r>
         <w:t>11. Conclusion</w:t>
       </w:r>
@@ -14354,17 +14483,18 @@
         <w:jc w:val="both"/>
       </w:pPr>
       <w:r>
-        <w:t>FaultNet implements controlled HTTP fault injection with saved experiments and a separate live development cockpit. A repeated evaluation of 100 workbench runs supports measurable delay, pacing, failure and restoration behavior. The timeout comparison improves observed completion from 0% to 100% by permitting longer waiting, while the high-rate pacing result exposes a concrete limitation. Packet analysis and reviewed routing observations provide complementary evidence. The system is useful for local develop</w:t>
+        <w:t xml:space="preserve">FaultNet implements controlled HTTP fault injection with saved experiments and a separate live development cockpit. A repeated evaluation of 100 workbench runs supports measurable delay, pacing, failure and restoration behavior. The timeout comparison improves observed </w:t>
       </w:r>
       <w:r>
-        <w:t>ment testing and networking education because configurations, measurements and explanations can be examined together.</w:t>
+        <w:lastRenderedPageBreak/>
+        <w:t>completion from 0% to 100% by permitting longer waiting, while the high-rate pacing result exposes a concrete limitation. Packet analysis and reviewed routing observations provide complementary evidence. The system is useful for local development testing and networking education because configurations, measurements and explanations can be examined together.</w:t>
       </w:r>
     </w:p>
     <w:p>
       <w:pPr>
         <w:pStyle w:val="Heading1"/>
       </w:pPr>
-      <w:bookmarkStart w:id="29" w:name="_Toc244118425"/>
+      <w:bookmarkStart w:id="29" w:name="_Toc244118973"/>
       <w:r>
         <w:t>12. Limitations and Future Enhancement</w:t>
       </w:r>
@@ -14407,7 +14537,7 @@
         <w:pStyle w:val="Heading1"/>
         <w:pageBreakBefore/>
       </w:pPr>
-      <w:bookmarkStart w:id="30" w:name="_Toc244118426"/>
+      <w:bookmarkStart w:id="30" w:name="_Toc244118974"/>
       <w:r>
         <w:lastRenderedPageBreak/>
         <w:t>References</w:t>
@@ -14429,7 +14559,7 @@
       <w:r>
         <w:t xml:space="preserve">DOI: </w:t>
       </w:r>
-      <w:hyperlink r:id="rId22">
+      <w:hyperlink r:id="rId23">
         <w:r>
           <w:t>10.1109/MS.2016.60</w:t>
         </w:r>
@@ -14439,7 +14569,7 @@
       <w:r>
         <w:t xml:space="preserve">Free full text: </w:t>
       </w:r>
-      <w:hyperlink r:id="rId23">
+      <w:hyperlink r:id="rId24">
         <w:r>
           <w:t>Full author manuscript deposited on arXiv</w:t>
         </w:r>
@@ -14460,7 +14590,7 @@
       <w:r>
         <w:t xml:space="preserve">DOI: </w:t>
       </w:r>
-      <w:hyperlink r:id="rId24">
+      <w:hyperlink r:id="rId25">
         <w:r>
           <w:t>10.1145/2723372.2723711</w:t>
         </w:r>
@@ -14470,7 +14600,7 @@
       <w:r>
         <w:t xml:space="preserve">Free full text: </w:t>
       </w:r>
-      <w:hyperlink r:id="rId25">
+      <w:hyperlink r:id="rId26">
         <w:r>
           <w:t>Full paper hosted by the author at UC Santa Cruz</w:t>
         </w:r>
@@ -14491,7 +14621,7 @@
       <w:r>
         <w:t xml:space="preserve">DOI: </w:t>
       </w:r>
-      <w:hyperlink r:id="rId26">
+      <w:hyperlink r:id="rId27">
         <w:r>
           <w:t>10.1145/1764873.1764876</w:t>
         </w:r>
@@ -14501,7 +14631,7 @@
       <w:r>
         <w:t xml:space="preserve">Free full text: </w:t>
       </w:r>
-      <w:hyperlink r:id="rId27">
+      <w:hyperlink r:id="rId28">
         <w:r>
           <w:t>Full author manuscript hosted at the University of Pisa</w:t>
         </w:r>
@@ -14522,7 +14652,7 @@
       <w:r>
         <w:t xml:space="preserve">DOI: </w:t>
       </w:r>
-      <w:hyperlink r:id="rId28">
+      <w:hyperlink r:id="rId29">
         <w:r>
           <w:t>10.1145/263105.263155</w:t>
         </w:r>
@@ -14532,7 +14662,7 @@
       <w:r>
         <w:t xml:space="preserve">Free full text: </w:t>
       </w:r>
-      <w:hyperlink r:id="rId29">
+      <w:hyperlink r:id="rId30">
         <w:r>
           <w:t>Full conference paper hosted at UC San Diego</w:t>
         </w:r>
@@ -14553,7 +14683,7 @@
       <w:r>
         <w:t xml:space="preserve">DOI: </w:t>
       </w:r>
-      <w:hyperlink r:id="rId30">
+      <w:hyperlink r:id="rId31">
         <w:r>
           <w:t>10.1145/1868447.1868466</w:t>
         </w:r>
@@ -14563,7 +14693,7 @@
       <w:r>
         <w:t xml:space="preserve">Free full text: </w:t>
       </w:r>
-      <w:hyperlink r:id="rId31">
+      <w:hyperlink r:id="rId32">
         <w:r>
           <w:t>Full workshop paper hosted by the author at Stanford University</w:t>
         </w:r>
@@ -14584,7 +14714,7 @@
       <w:r>
         <w:t xml:space="preserve">DOI: </w:t>
       </w:r>
-      <w:hyperlink r:id="rId32">
+      <w:hyperlink r:id="rId33">
         <w:r>
           <w:t>10.1145/2413176.2413206</w:t>
         </w:r>
@@ -14594,7 +14724,7 @@
       <w:r>
         <w:t xml:space="preserve">Free full text: </w:t>
       </w:r>
-      <w:hyperlink r:id="rId33">
+      <w:hyperlink r:id="rId34">
         <w:r>
           <w:t>Full published conference paper from the ACM SIGCOMM conference proceedings site</w:t>
         </w:r>
@@ -14604,7 +14734,7 @@
       <w:r>
         <w:t xml:space="preserve">Additional author copy: </w:t>
       </w:r>
-      <w:hyperlink r:id="rId34">
+      <w:hyperlink r:id="rId35">
         <w:r>
           <w:t>Stanford-hosted full conference paper</w:t>
         </w:r>
@@ -14615,7 +14745,7 @@
         <w:pStyle w:val="Heading1"/>
         <w:pageBreakBefore/>
       </w:pPr>
-      <w:bookmarkStart w:id="31" w:name="_Toc244118427"/>
+      <w:bookmarkStart w:id="31" w:name="_Toc244118975"/>
       <w:r>
         <w:lastRenderedPageBreak/>
         <w:t>Appendix A Reproduction Procedure</w:t>
@@ -14680,7 +14810,7 @@
       </w:r>
     </w:p>
     <w:sectPr>
-      <w:footerReference w:type="default" r:id="rId35"/>
+      <w:footerReference w:type="default" r:id="rId36"/>
       <w:pgSz w:w="11909" w:h="16834"/>
       <w:pgMar w:top="1224" w:right="1368" w:bottom="1224" w:left="1368" w:header="720" w:footer="576" w:gutter="0"/>
       <w:cols w:space="720"/>
@@ -26385,7 +26515,7 @@
     <w:autoRedefine/>
     <w:uiPriority w:val="39"/>
     <w:unhideWhenUsed/>
-    <w:rsid w:val="00F25C3D"/>
+    <w:rsid w:val="000473FC"/>
     <w:pPr>
       <w:spacing w:after="100"/>
       <w:ind w:left="480"/>

</xml_diff>

<commit_message>
Polish report figures, citations and reproduction guidance
</commit_message>
<xml_diff>
--- a/docs/reports/FaultNet-final-report-revised.docx
+++ b/docs/reports/FaultNet-final-report-revised.docx
@@ -141,6 +141,23 @@
     </w:p>
     <w:p>
       <w:pPr>
+        <w:spacing w:after="360"/>
+        <w:jc w:val="center"/>
+        <w:rPr>
+          <w:b/>
+          <w:bCs/>
+        </w:rPr>
+      </w:pPr>
+      <w:r>
+        <w:rPr>
+          <w:b/>
+          <w:bCs/>
+        </w:rPr>
+        <w:t>October 2026</w:t>
+      </w:r>
+    </w:p>
+    <w:p>
+      <w:pPr>
         <w:pageBreakBefore/>
         <w:jc w:val="center"/>
         <w:rPr>
@@ -202,8 +219,10 @@
     </w:p>
     <w:p>
       <w:pPr>
-        <w:spacing w:before="720"/>
-      </w:pPr>
+        <w:jc w:val="both"/>
+      </w:pPr>
+    </w:p>
+    <w:p>
       <w:r>
         <w:t>Place:</w:t>
       </w:r>
@@ -212,8 +231,12 @@
       </w:r>
     </w:p>
     <w:p>
-      <w:pPr>
-        <w:spacing w:before="480"/>
+      <w:r>
+        <w:t>Date: 28 October, 2026</w:t>
+      </w:r>
+    </w:p>
+    <w:p>
+      <w:pPr>
         <w:jc w:val="right"/>
       </w:pPr>
       <w:r>
@@ -222,7 +245,6 @@
     </w:p>
     <w:p>
       <w:pPr>
-        <w:spacing w:before="240"/>
         <w:jc w:val="right"/>
       </w:pPr>
       <w:r>
@@ -276,7 +298,7 @@
       <w:r>
         <w:fldChar w:fldCharType="separate"/>
       </w:r>
-      <w:hyperlink w:anchor="_Toc244118944" w:history="1">
+      <w:hyperlink w:anchor="_Toc244121690" w:history="1">
         <w:r>
           <w:rPr>
             <w:rStyle w:val="Hyperlink"/>
@@ -303,7 +325,7 @@
             <w:noProof/>
             <w:webHidden/>
           </w:rPr>
-          <w:instrText xml:space="preserve"> PAGEREF _Toc244118944 \h </w:instrText>
+          <w:instrText xml:space="preserve"> PAGEREF _Toc244121690 \h </w:instrText>
         </w:r>
         <w:r>
           <w:rPr>
@@ -347,7 +369,7 @@
           <w14:ligatures w14:val="standardContextual"/>
         </w:rPr>
       </w:pPr>
-      <w:hyperlink w:anchor="_Toc244118945" w:history="1">
+      <w:hyperlink w:anchor="_Toc244121691" w:history="1">
         <w:r>
           <w:rPr>
             <w:rStyle w:val="Hyperlink"/>
@@ -374,7 +396,7 @@
             <w:noProof/>
             <w:webHidden/>
           </w:rPr>
-          <w:instrText xml:space="preserve"> PAGEREF _Toc244118945 \h </w:instrText>
+          <w:instrText xml:space="preserve"> PAGEREF _Toc244121691 \h </w:instrText>
         </w:r>
         <w:r>
           <w:rPr>
@@ -418,7 +440,7 @@
           <w14:ligatures w14:val="standardContextual"/>
         </w:rPr>
       </w:pPr>
-      <w:hyperlink w:anchor="_Toc244118946" w:history="1">
+      <w:hyperlink w:anchor="_Toc244121692" w:history="1">
         <w:r>
           <w:rPr>
             <w:rStyle w:val="Hyperlink"/>
@@ -445,7 +467,7 @@
             <w:noProof/>
             <w:webHidden/>
           </w:rPr>
-          <w:instrText xml:space="preserve"> PAGEREF _Toc244118946 \h </w:instrText>
+          <w:instrText xml:space="preserve"> PAGEREF _Toc244121692 \h </w:instrText>
         </w:r>
         <w:r>
           <w:rPr>
@@ -489,7 +511,7 @@
           <w14:ligatures w14:val="standardContextual"/>
         </w:rPr>
       </w:pPr>
-      <w:hyperlink w:anchor="_Toc244118947" w:history="1">
+      <w:hyperlink w:anchor="_Toc244121693" w:history="1">
         <w:r>
           <w:rPr>
             <w:rStyle w:val="Hyperlink"/>
@@ -516,7 +538,7 @@
             <w:noProof/>
             <w:webHidden/>
           </w:rPr>
-          <w:instrText xml:space="preserve"> PAGEREF _Toc244118947 \h </w:instrText>
+          <w:instrText xml:space="preserve"> PAGEREF _Toc244121693 \h </w:instrText>
         </w:r>
         <w:r>
           <w:rPr>
@@ -560,7 +582,7 @@
           <w14:ligatures w14:val="standardContextual"/>
         </w:rPr>
       </w:pPr>
-      <w:hyperlink w:anchor="_Toc244118948" w:history="1">
+      <w:hyperlink w:anchor="_Toc244121694" w:history="1">
         <w:r>
           <w:rPr>
             <w:rStyle w:val="Hyperlink"/>
@@ -587,7 +609,7 @@
             <w:noProof/>
             <w:webHidden/>
           </w:rPr>
-          <w:instrText xml:space="preserve"> PAGEREF _Toc244118948 \h </w:instrText>
+          <w:instrText xml:space="preserve"> PAGEREF _Toc244121694 \h </w:instrText>
         </w:r>
         <w:r>
           <w:rPr>
@@ -631,7 +653,7 @@
           <w14:ligatures w14:val="standardContextual"/>
         </w:rPr>
       </w:pPr>
-      <w:hyperlink w:anchor="_Toc244118949" w:history="1">
+      <w:hyperlink w:anchor="_Toc244121695" w:history="1">
         <w:r>
           <w:rPr>
             <w:rStyle w:val="Hyperlink"/>
@@ -658,7 +680,7 @@
             <w:noProof/>
             <w:webHidden/>
           </w:rPr>
-          <w:instrText xml:space="preserve"> PAGEREF _Toc244118949 \h </w:instrText>
+          <w:instrText xml:space="preserve"> PAGEREF _Toc244121695 \h </w:instrText>
         </w:r>
         <w:r>
           <w:rPr>
@@ -702,7 +724,7 @@
           <w14:ligatures w14:val="standardContextual"/>
         </w:rPr>
       </w:pPr>
-      <w:hyperlink w:anchor="_Toc244118950" w:history="1">
+      <w:hyperlink w:anchor="_Toc244121696" w:history="1">
         <w:r>
           <w:rPr>
             <w:rStyle w:val="Hyperlink"/>
@@ -729,7 +751,7 @@
             <w:noProof/>
             <w:webHidden/>
           </w:rPr>
-          <w:instrText xml:space="preserve"> PAGEREF _Toc244118950 \h </w:instrText>
+          <w:instrText xml:space="preserve"> PAGEREF _Toc244121696 \h </w:instrText>
         </w:r>
         <w:r>
           <w:rPr>
@@ -773,7 +795,7 @@
           <w14:ligatures w14:val="standardContextual"/>
         </w:rPr>
       </w:pPr>
-      <w:hyperlink w:anchor="_Toc244118951" w:history="1">
+      <w:hyperlink w:anchor="_Toc244121697" w:history="1">
         <w:r>
           <w:rPr>
             <w:rStyle w:val="Hyperlink"/>
@@ -800,7 +822,7 @@
             <w:noProof/>
             <w:webHidden/>
           </w:rPr>
-          <w:instrText xml:space="preserve"> PAGEREF _Toc244118951 \h </w:instrText>
+          <w:instrText xml:space="preserve"> PAGEREF _Toc244121697 \h </w:instrText>
         </w:r>
         <w:r>
           <w:rPr>
@@ -844,7 +866,7 @@
           <w14:ligatures w14:val="standardContextual"/>
         </w:rPr>
       </w:pPr>
-      <w:hyperlink w:anchor="_Toc244118952" w:history="1">
+      <w:hyperlink w:anchor="_Toc244121698" w:history="1">
         <w:r>
           <w:rPr>
             <w:rStyle w:val="Hyperlink"/>
@@ -871,7 +893,7 @@
             <w:noProof/>
             <w:webHidden/>
           </w:rPr>
-          <w:instrText xml:space="preserve"> PAGEREF _Toc244118952 \h </w:instrText>
+          <w:instrText xml:space="preserve"> PAGEREF _Toc244121698 \h </w:instrText>
         </w:r>
         <w:r>
           <w:rPr>
@@ -915,7 +937,7 @@
           <w14:ligatures w14:val="standardContextual"/>
         </w:rPr>
       </w:pPr>
-      <w:hyperlink w:anchor="_Toc244118953" w:history="1">
+      <w:hyperlink w:anchor="_Toc244121699" w:history="1">
         <w:r>
           <w:rPr>
             <w:rStyle w:val="Hyperlink"/>
@@ -942,7 +964,7 @@
             <w:noProof/>
             <w:webHidden/>
           </w:rPr>
-          <w:instrText xml:space="preserve"> PAGEREF _Toc244118953 \h </w:instrText>
+          <w:instrText xml:space="preserve"> PAGEREF _Toc244121699 \h </w:instrText>
         </w:r>
         <w:r>
           <w:rPr>
@@ -986,7 +1008,7 @@
           <w14:ligatures w14:val="standardContextual"/>
         </w:rPr>
       </w:pPr>
-      <w:hyperlink w:anchor="_Toc244118954" w:history="1">
+      <w:hyperlink w:anchor="_Toc244121700" w:history="1">
         <w:r>
           <w:rPr>
             <w:rStyle w:val="Hyperlink"/>
@@ -1013,7 +1035,7 @@
             <w:noProof/>
             <w:webHidden/>
           </w:rPr>
-          <w:instrText xml:space="preserve"> PAGEREF _Toc244118954 \h </w:instrText>
+          <w:instrText xml:space="preserve"> PAGEREF _Toc244121700 \h </w:instrText>
         </w:r>
         <w:r>
           <w:rPr>
@@ -1057,7 +1079,7 @@
           <w14:ligatures w14:val="standardContextual"/>
         </w:rPr>
       </w:pPr>
-      <w:hyperlink w:anchor="_Toc244118955" w:history="1">
+      <w:hyperlink w:anchor="_Toc244121701" w:history="1">
         <w:r>
           <w:rPr>
             <w:rStyle w:val="Hyperlink"/>
@@ -1084,7 +1106,7 @@
             <w:noProof/>
             <w:webHidden/>
           </w:rPr>
-          <w:instrText xml:space="preserve"> PAGEREF _Toc244118955 \h </w:instrText>
+          <w:instrText xml:space="preserve"> PAGEREF _Toc244121701 \h </w:instrText>
         </w:r>
         <w:r>
           <w:rPr>
@@ -1128,7 +1150,7 @@
           <w14:ligatures w14:val="standardContextual"/>
         </w:rPr>
       </w:pPr>
-      <w:hyperlink w:anchor="_Toc244118956" w:history="1">
+      <w:hyperlink w:anchor="_Toc244121702" w:history="1">
         <w:r>
           <w:rPr>
             <w:rStyle w:val="Hyperlink"/>
@@ -1155,7 +1177,7 @@
             <w:noProof/>
             <w:webHidden/>
           </w:rPr>
-          <w:instrText xml:space="preserve"> PAGEREF _Toc244118956 \h </w:instrText>
+          <w:instrText xml:space="preserve"> PAGEREF _Toc244121702 \h </w:instrText>
         </w:r>
         <w:r>
           <w:rPr>
@@ -1199,7 +1221,7 @@
           <w14:ligatures w14:val="standardContextual"/>
         </w:rPr>
       </w:pPr>
-      <w:hyperlink w:anchor="_Toc244118957" w:history="1">
+      <w:hyperlink w:anchor="_Toc244121703" w:history="1">
         <w:r>
           <w:rPr>
             <w:rStyle w:val="Hyperlink"/>
@@ -1226,7 +1248,7 @@
             <w:noProof/>
             <w:webHidden/>
           </w:rPr>
-          <w:instrText xml:space="preserve"> PAGEREF _Toc244118957 \h </w:instrText>
+          <w:instrText xml:space="preserve"> PAGEREF _Toc244121703 \h </w:instrText>
         </w:r>
         <w:r>
           <w:rPr>
@@ -1270,7 +1292,7 @@
           <w14:ligatures w14:val="standardContextual"/>
         </w:rPr>
       </w:pPr>
-      <w:hyperlink w:anchor="_Toc244118958" w:history="1">
+      <w:hyperlink w:anchor="_Toc244121704" w:history="1">
         <w:r>
           <w:rPr>
             <w:rStyle w:val="Hyperlink"/>
@@ -1297,7 +1319,7 @@
             <w:noProof/>
             <w:webHidden/>
           </w:rPr>
-          <w:instrText xml:space="preserve"> PAGEREF _Toc244118958 \h </w:instrText>
+          <w:instrText xml:space="preserve"> PAGEREF _Toc244121704 \h </w:instrText>
         </w:r>
         <w:r>
           <w:rPr>
@@ -1341,7 +1363,7 @@
           <w14:ligatures w14:val="standardContextual"/>
         </w:rPr>
       </w:pPr>
-      <w:hyperlink w:anchor="_Toc244118959" w:history="1">
+      <w:hyperlink w:anchor="_Toc244121705" w:history="1">
         <w:r>
           <w:rPr>
             <w:rStyle w:val="Hyperlink"/>
@@ -1368,7 +1390,7 @@
             <w:noProof/>
             <w:webHidden/>
           </w:rPr>
-          <w:instrText xml:space="preserve"> PAGEREF _Toc244118959 \h </w:instrText>
+          <w:instrText xml:space="preserve"> PAGEREF _Toc244121705 \h </w:instrText>
         </w:r>
         <w:r>
           <w:rPr>
@@ -1412,7 +1434,7 @@
           <w14:ligatures w14:val="standardContextual"/>
         </w:rPr>
       </w:pPr>
-      <w:hyperlink w:anchor="_Toc244118960" w:history="1">
+      <w:hyperlink w:anchor="_Toc244121706" w:history="1">
         <w:r>
           <w:rPr>
             <w:rStyle w:val="Hyperlink"/>
@@ -1439,7 +1461,7 @@
             <w:noProof/>
             <w:webHidden/>
           </w:rPr>
-          <w:instrText xml:space="preserve"> PAGEREF _Toc244118960 \h </w:instrText>
+          <w:instrText xml:space="preserve"> PAGEREF _Toc244121706 \h </w:instrText>
         </w:r>
         <w:r>
           <w:rPr>
@@ -1485,7 +1507,7 @@
           <w14:ligatures w14:val="standardContextual"/>
         </w:rPr>
       </w:pPr>
-      <w:hyperlink w:anchor="_Toc244118961" w:history="1">
+      <w:hyperlink w:anchor="_Toc244121707" w:history="1">
         <w:r>
           <w:rPr>
             <w:rStyle w:val="Hyperlink"/>
@@ -1512,7 +1534,7 @@
             <w:noProof/>
             <w:webHidden/>
           </w:rPr>
-          <w:instrText xml:space="preserve"> PAGEREF _Toc244118961 \h </w:instrText>
+          <w:instrText xml:space="preserve"> PAGEREF _Toc244121707 \h </w:instrText>
         </w:r>
         <w:r>
           <w:rPr>
@@ -1558,7 +1580,7 @@
           <w14:ligatures w14:val="standardContextual"/>
         </w:rPr>
       </w:pPr>
-      <w:hyperlink w:anchor="_Toc244118962" w:history="1">
+      <w:hyperlink w:anchor="_Toc244121708" w:history="1">
         <w:r>
           <w:rPr>
             <w:rStyle w:val="Hyperlink"/>
@@ -1585,7 +1607,7 @@
             <w:noProof/>
             <w:webHidden/>
           </w:rPr>
-          <w:instrText xml:space="preserve"> PAGEREF _Toc244118962 \h </w:instrText>
+          <w:instrText xml:space="preserve"> PAGEREF _Toc244121708 \h </w:instrText>
         </w:r>
         <w:r>
           <w:rPr>
@@ -1631,7 +1653,7 @@
           <w14:ligatures w14:val="standardContextual"/>
         </w:rPr>
       </w:pPr>
-      <w:hyperlink w:anchor="_Toc244118963" w:history="1">
+      <w:hyperlink w:anchor="_Toc244121709" w:history="1">
         <w:r>
           <w:rPr>
             <w:rStyle w:val="Hyperlink"/>
@@ -1658,7 +1680,7 @@
             <w:noProof/>
             <w:webHidden/>
           </w:rPr>
-          <w:instrText xml:space="preserve"> PAGEREF _Toc244118963 \h </w:instrText>
+          <w:instrText xml:space="preserve"> PAGEREF _Toc244121709 \h </w:instrText>
         </w:r>
         <w:r>
           <w:rPr>
@@ -1704,7 +1726,7 @@
           <w14:ligatures w14:val="standardContextual"/>
         </w:rPr>
       </w:pPr>
-      <w:hyperlink w:anchor="_Toc244118964" w:history="1">
+      <w:hyperlink w:anchor="_Toc244121710" w:history="1">
         <w:r>
           <w:rPr>
             <w:rStyle w:val="Hyperlink"/>
@@ -1731,7 +1753,7 @@
             <w:noProof/>
             <w:webHidden/>
           </w:rPr>
-          <w:instrText xml:space="preserve"> PAGEREF _Toc244118964 \h </w:instrText>
+          <w:instrText xml:space="preserve"> PAGEREF _Toc244121710 \h </w:instrText>
         </w:r>
         <w:r>
           <w:rPr>
@@ -1777,7 +1799,7 @@
           <w14:ligatures w14:val="standardContextual"/>
         </w:rPr>
       </w:pPr>
-      <w:hyperlink w:anchor="_Toc244118965" w:history="1">
+      <w:hyperlink w:anchor="_Toc244121711" w:history="1">
         <w:r>
           <w:rPr>
             <w:rStyle w:val="Hyperlink"/>
@@ -1804,7 +1826,7 @@
             <w:noProof/>
             <w:webHidden/>
           </w:rPr>
-          <w:instrText xml:space="preserve"> PAGEREF _Toc244118965 \h </w:instrText>
+          <w:instrText xml:space="preserve"> PAGEREF _Toc244121711 \h </w:instrText>
         </w:r>
         <w:r>
           <w:rPr>
@@ -1850,7 +1872,7 @@
           <w14:ligatures w14:val="standardContextual"/>
         </w:rPr>
       </w:pPr>
-      <w:hyperlink w:anchor="_Toc244118966" w:history="1">
+      <w:hyperlink w:anchor="_Toc244121712" w:history="1">
         <w:r>
           <w:rPr>
             <w:rStyle w:val="Hyperlink"/>
@@ -1877,7 +1899,7 @@
             <w:noProof/>
             <w:webHidden/>
           </w:rPr>
-          <w:instrText xml:space="preserve"> PAGEREF _Toc244118966 \h </w:instrText>
+          <w:instrText xml:space="preserve"> PAGEREF _Toc244121712 \h </w:instrText>
         </w:r>
         <w:r>
           <w:rPr>
@@ -1923,7 +1945,7 @@
           <w14:ligatures w14:val="standardContextual"/>
         </w:rPr>
       </w:pPr>
-      <w:hyperlink w:anchor="_Toc244118967" w:history="1">
+      <w:hyperlink w:anchor="_Toc244121713" w:history="1">
         <w:r>
           <w:rPr>
             <w:rStyle w:val="Hyperlink"/>
@@ -1950,7 +1972,7 @@
             <w:noProof/>
             <w:webHidden/>
           </w:rPr>
-          <w:instrText xml:space="preserve"> PAGEREF _Toc244118967 \h </w:instrText>
+          <w:instrText xml:space="preserve"> PAGEREF _Toc244121713 \h </w:instrText>
         </w:r>
         <w:r>
           <w:rPr>
@@ -1994,7 +2016,7 @@
           <w14:ligatures w14:val="standardContextual"/>
         </w:rPr>
       </w:pPr>
-      <w:hyperlink w:anchor="_Toc244118968" w:history="1">
+      <w:hyperlink w:anchor="_Toc244121714" w:history="1">
         <w:r>
           <w:rPr>
             <w:rStyle w:val="Hyperlink"/>
@@ -2021,7 +2043,7 @@
             <w:noProof/>
             <w:webHidden/>
           </w:rPr>
-          <w:instrText xml:space="preserve"> PAGEREF _Toc244118968 \h </w:instrText>
+          <w:instrText xml:space="preserve"> PAGEREF _Toc244121714 \h </w:instrText>
         </w:r>
         <w:r>
           <w:rPr>
@@ -2065,7 +2087,7 @@
           <w14:ligatures w14:val="standardContextual"/>
         </w:rPr>
       </w:pPr>
-      <w:hyperlink w:anchor="_Toc244118969" w:history="1">
+      <w:hyperlink w:anchor="_Toc244121715" w:history="1">
         <w:r>
           <w:rPr>
             <w:rStyle w:val="Hyperlink"/>
@@ -2092,7 +2114,7 @@
             <w:noProof/>
             <w:webHidden/>
           </w:rPr>
-          <w:instrText xml:space="preserve"> PAGEREF _Toc244118969 \h </w:instrText>
+          <w:instrText xml:space="preserve"> PAGEREF _Toc244121715 \h </w:instrText>
         </w:r>
         <w:r>
           <w:rPr>
@@ -2136,7 +2158,7 @@
           <w14:ligatures w14:val="standardContextual"/>
         </w:rPr>
       </w:pPr>
-      <w:hyperlink w:anchor="_Toc244118970" w:history="1">
+      <w:hyperlink w:anchor="_Toc244121716" w:history="1">
         <w:r>
           <w:rPr>
             <w:rStyle w:val="Hyperlink"/>
@@ -2163,7 +2185,7 @@
             <w:noProof/>
             <w:webHidden/>
           </w:rPr>
-          <w:instrText xml:space="preserve"> PAGEREF _Toc244118970 \h </w:instrText>
+          <w:instrText xml:space="preserve"> PAGEREF _Toc244121716 \h </w:instrText>
         </w:r>
         <w:r>
           <w:rPr>
@@ -2207,7 +2229,7 @@
           <w14:ligatures w14:val="standardContextual"/>
         </w:rPr>
       </w:pPr>
-      <w:hyperlink w:anchor="_Toc244118971" w:history="1">
+      <w:hyperlink w:anchor="_Toc244121717" w:history="1">
         <w:r>
           <w:rPr>
             <w:rStyle w:val="Hyperlink"/>
@@ -2234,7 +2256,7 @@
             <w:noProof/>
             <w:webHidden/>
           </w:rPr>
-          <w:instrText xml:space="preserve"> PAGEREF _Toc244118971 \h </w:instrText>
+          <w:instrText xml:space="preserve"> PAGEREF _Toc244121717 \h </w:instrText>
         </w:r>
         <w:r>
           <w:rPr>
@@ -2278,7 +2300,7 @@
           <w14:ligatures w14:val="standardContextual"/>
         </w:rPr>
       </w:pPr>
-      <w:hyperlink w:anchor="_Toc244118972" w:history="1">
+      <w:hyperlink w:anchor="_Toc244121718" w:history="1">
         <w:r>
           <w:rPr>
             <w:rStyle w:val="Hyperlink"/>
@@ -2305,7 +2327,7 @@
             <w:noProof/>
             <w:webHidden/>
           </w:rPr>
-          <w:instrText xml:space="preserve"> PAGEREF _Toc244118972 \h </w:instrText>
+          <w:instrText xml:space="preserve"> PAGEREF _Toc244121718 \h </w:instrText>
         </w:r>
         <w:r>
           <w:rPr>
@@ -2349,7 +2371,7 @@
           <w14:ligatures w14:val="standardContextual"/>
         </w:rPr>
       </w:pPr>
-      <w:hyperlink w:anchor="_Toc244118973" w:history="1">
+      <w:hyperlink w:anchor="_Toc244121719" w:history="1">
         <w:r>
           <w:rPr>
             <w:rStyle w:val="Hyperlink"/>
@@ -2376,7 +2398,7 @@
             <w:noProof/>
             <w:webHidden/>
           </w:rPr>
-          <w:instrText xml:space="preserve"> PAGEREF _Toc244118973 \h </w:instrText>
+          <w:instrText xml:space="preserve"> PAGEREF _Toc244121719 \h </w:instrText>
         </w:r>
         <w:r>
           <w:rPr>
@@ -2420,7 +2442,7 @@
           <w14:ligatures w14:val="standardContextual"/>
         </w:rPr>
       </w:pPr>
-      <w:hyperlink w:anchor="_Toc244118974" w:history="1">
+      <w:hyperlink w:anchor="_Toc244121720" w:history="1">
         <w:r>
           <w:rPr>
             <w:rStyle w:val="Hyperlink"/>
@@ -2447,7 +2469,7 @@
             <w:noProof/>
             <w:webHidden/>
           </w:rPr>
-          <w:instrText xml:space="preserve"> PAGEREF _Toc244118974 \h </w:instrText>
+          <w:instrText xml:space="preserve"> PAGEREF _Toc244121720 \h </w:instrText>
         </w:r>
         <w:r>
           <w:rPr>
@@ -2480,77 +2502,6 @@
     </w:p>
     <w:p>
       <w:pPr>
-        <w:pStyle w:val="TOC1"/>
-        <w:rPr>
-          <w:rFonts w:asciiTheme="minorHAnsi" w:eastAsiaTheme="minorEastAsia" w:hAnsiTheme="minorHAnsi" w:cstheme="minorBidi"/>
-          <w:noProof/>
-          <w:color w:val="auto"/>
-          <w:kern w:val="2"/>
-          <w:sz w:val="24"/>
-          <w:szCs w:val="24"/>
-          <w14:ligatures w14:val="standardContextual"/>
-        </w:rPr>
-      </w:pPr>
-      <w:hyperlink w:anchor="_Toc244118975" w:history="1">
-        <w:r>
-          <w:rPr>
-            <w:rStyle w:val="Hyperlink"/>
-            <w:noProof/>
-          </w:rPr>
-          <w:t>Appendix A Reproduction Procedure</w:t>
-        </w:r>
-        <w:r>
-          <w:rPr>
-            <w:noProof/>
-            <w:webHidden/>
-          </w:rPr>
-          <w:tab/>
-        </w:r>
-        <w:r>
-          <w:rPr>
-            <w:noProof/>
-            <w:webHidden/>
-          </w:rPr>
-          <w:fldChar w:fldCharType="begin"/>
-        </w:r>
-        <w:r>
-          <w:rPr>
-            <w:noProof/>
-            <w:webHidden/>
-          </w:rPr>
-          <w:instrText xml:space="preserve"> PAGEREF _Toc244118975 \h </w:instrText>
-        </w:r>
-        <w:r>
-          <w:rPr>
-            <w:noProof/>
-            <w:webHidden/>
-          </w:rPr>
-        </w:r>
-        <w:r>
-          <w:rPr>
-            <w:noProof/>
-            <w:webHidden/>
-          </w:rPr>
-          <w:fldChar w:fldCharType="separate"/>
-        </w:r>
-        <w:r>
-          <w:rPr>
-            <w:noProof/>
-            <w:webHidden/>
-          </w:rPr>
-          <w:t>28</w:t>
-        </w:r>
-        <w:r>
-          <w:rPr>
-            <w:noProof/>
-            <w:webHidden/>
-          </w:rPr>
-          <w:fldChar w:fldCharType="end"/>
-        </w:r>
-      </w:hyperlink>
-    </w:p>
-    <w:p>
-      <w:pPr>
         <w:jc w:val="both"/>
       </w:pPr>
       <w:r>
@@ -2562,7 +2513,7 @@
         <w:pStyle w:val="Heading1"/>
         <w:pageBreakBefore/>
       </w:pPr>
-      <w:bookmarkStart w:id="0" w:name="_Toc244118944"/>
+      <w:bookmarkStart w:id="0" w:name="_Toc244121690"/>
       <w:r>
         <w:lastRenderedPageBreak/>
         <w:t>1. Introduction</w:t>
@@ -2590,14 +2541,20 @@
         <w:jc w:val="both"/>
       </w:pPr>
       <w:r>
-        <w:t>The central contribution is a reproducible connection between configuration, measurement and interpretation. The evaluation measures fault calibration, request completion, payload goodput, timeout tradeoffs and restoration. It also reports the cost of interception and the conditions under which the configured delivery rate is not attained. The project does not assume that a testing tool makes a connection faster; it makes failure behavior inspectable.</w:t>
+        <w:t xml:space="preserve">The central contribution is a reproducible connection between configuration, measurement and interpretation. The evaluation </w:t>
+      </w:r>
+      <w:r>
+        <w:t>measures</w:t>
+      </w:r>
+      <w:r>
+        <w:t xml:space="preserve"> fault calibration, request completion, payload goodput, timeout tradeoffs and restoration. It also reports the cost of interception and the conditions under which the configured delivery rate is not attained. The project does not assume that a testing tool makes a connection faster; it makes failure behavior inspectable.</w:t>
       </w:r>
     </w:p>
     <w:p>
       <w:pPr>
         <w:pStyle w:val="Heading2"/>
       </w:pPr>
-      <w:bookmarkStart w:id="1" w:name="_Toc244118945"/>
+      <w:bookmarkStart w:id="1" w:name="_Toc244121691"/>
       <w:r>
         <w:t>1.1 Practical Applications</w:t>
       </w:r>
@@ -2623,7 +2580,7 @@
       <w:pPr>
         <w:pStyle w:val="Heading1"/>
       </w:pPr>
-      <w:bookmarkStart w:id="2" w:name="_Toc244118946"/>
+      <w:bookmarkStart w:id="2" w:name="_Toc244121692"/>
       <w:r>
         <w:t>2. Problem Statement</w:t>
       </w:r>
@@ -2649,7 +2606,7 @@
       <w:pPr>
         <w:pStyle w:val="Heading1"/>
       </w:pPr>
-      <w:bookmarkStart w:id="3" w:name="_Toc244118947"/>
+      <w:bookmarkStart w:id="3" w:name="_Toc244121693"/>
       <w:r>
         <w:lastRenderedPageBreak/>
         <w:t>3. Objectives</w:t>
@@ -2716,7 +2673,7 @@
       <w:pPr>
         <w:pStyle w:val="Heading1"/>
       </w:pPr>
-      <w:bookmarkStart w:id="4" w:name="_Toc244118948"/>
+      <w:bookmarkStart w:id="4" w:name="_Toc244121694"/>
       <w:r>
         <w:t>4. Literature Review and Existing System</w:t>
       </w:r>
@@ -2735,10 +2692,7 @@
         <w:jc w:val="both"/>
       </w:pPr>
       <w:r>
-        <w:t>Basiri et al. describe chaos engineering as experimentation on distributed systems using hypotheses about measurable steady-state behavior [1]. The study emphasizes observing the effect of disruptive events at the system boundary. FaultNet adopts a bounded local comparison: a fixed workload is measured before, during and after a selected fault. Its successful-payload and latency measurements are local HTTP indicators; the project does not claim to reproduce Netflix's production-scale experiments or business</w:t>
-      </w:r>
-      <w:r>
-        <w:t>-level availability metrics.</w:t>
+        <w:t>Basiri et al. describe chaos engineering as experimentation on distributed systems using hypotheses about measurable steady-state behavior [1]. The study emphasizes observing the effect of disruptive events at the system boundary. FaultNet adopts a bounded local comparison: a fixed workload is measured before, during and after a selected fault. Its successful-payload and latency measurements are local HTTP indicators; the project does not claim to reproduce Netflix's production-scale experiments or business-level availability metrics.</w:t>
       </w:r>
     </w:p>
     <w:p>
@@ -2746,10 +2700,7 @@
         <w:jc w:val="both"/>
       </w:pPr>
       <w:r>
-        <w:t>Alvaro, Rosen and Hellerstein introduce lineage-driven fault injection, implemented by MOLLY, which reasons backward from a successful outcome to identify failure combinations worth testing [2]. This provides a research basis for relating an injected failure to an explicit outcome instead of merely displaying fault settings. FaultNet uses operator-selected scenarios and a fixed response contract. It does not perform lineage analysis, automatically search distributed failure schedules or provide MOLLY's conf</w:t>
-      </w:r>
-      <w:r>
-        <w:t>iguration-specific completeness guarantees.</w:t>
+        <w:t>Alvaro, Rosen and Hellerstein introduce lineage-driven fault injection, implemented by MOLLY, which reasons backward from a successful outcome to identify failure combinations worth testing [2]. This provides a research basis for relating an injected failure to an explicit outcome instead of merely displaying fault settings. FaultNet uses operator-selected scenarios and a fixed response contract. It does not perform lineage analysis, automatically search distributed failure schedules or provide MOLLY's configuration-specific completeness guarantees.</w:t>
       </w:r>
     </w:p>
     <w:p>
@@ -2757,10 +2708,7 @@
         <w:jc w:val="both"/>
       </w:pPr>
       <w:r>
-        <w:t>Carbone and Rizzo examine Dummynet's link-emulation capabilities and the operating conditions that affect experimental accuracy [3]. Their work makes fidelity a measurement question, rather than an assumption that a configured rate or delay is achieved exactly. FaultNet applies HTTP forwarding waits and body pacing in user space. Its calibration study therefore compares observed timing and payload goodput with configured settings. Dummynet models network-link behavior more broadly; the two systems act at di</w:t>
-      </w:r>
-      <w:r>
-        <w:t>fferent layers and are not benchmarked against each other here.</w:t>
+        <w:t>Carbone and Rizzo examine Dummynet's link-emulation capabilities and the operating conditions that affect experimental accuracy [3]. Their work makes fidelity a measurement question, rather than an assumption that a configured rate or delay is achieved exactly. FaultNet applies HTTP forwarding waits and body pacing in user space. Its calibration study therefore compares observed timing and payload goodput with configured settings. Dummynet models network-link behavior more broadly; the two systems act at different layers and are not benchmarked against each other here.</w:t>
       </w:r>
     </w:p>
     <w:p>
@@ -2780,10 +2728,7 @@
         <w:jc w:val="both"/>
       </w:pPr>
       <w:r>
-        <w:t xml:space="preserve">Lantz, Heller and McKeown present Mininet as an interactive network-prototyping environment using lightweight operating-system virtualization [5]. The study demonstrates the value of constructing controllable topologies on one computer while acknowledging performance-fidelity limits. FaultNet uses a real local HTTP data path, whereas its separate Packet Tracer cases examine simulated routing and alternate-path selection. These activities answer different questions. The project does not claim to run Mininet </w:t>
-      </w:r>
-      <w:r>
-        <w:t>or to equate a simulator topology with a measured production network.</w:t>
+        <w:t>Lantz, Heller and McKeown present Mininet as an interactive network-prototyping environment using lightweight operating-system virtualization [5]. The study demonstrates the value of constructing controllable topologies on one computer while acknowledging performance-fidelity limits. FaultNet uses a real local HTTP data path, whereas its separate Packet Tracer cases examine simulated routing and alternate-path selection. These activities answer different questions. The project does not claim to run Mininet or to equate a simulator topology with a measured production network.</w:t>
       </w:r>
     </w:p>
     <w:p>
@@ -2791,10 +2736,7 @@
         <w:jc w:val="both"/>
       </w:pPr>
       <w:r>
-        <w:t>Handigol et al. evaluate reproducible network experiments using container-based emulation and Mininet-HiFi, emphasizing resource isolation, provisioning and monitoring [6]. Their study connects a repeatable experimental setup with the credibility of reported results. FaultNet records settings, runtime, sample counts and validated outcomes, and supplies analysis scripts for its tables and figures. The present evaluation retains ordinary desktop scheduling and one host, so the report confines its quantitative</w:t>
-      </w:r>
-      <w:r>
-        <w:t xml:space="preserve"> conclusions to that environment rather than claiming equivalent isolation or performance fidelity.</w:t>
+        <w:t>Handigol et al. evaluate reproducible network experiments using container-based emulation and Mininet-HiFi, emphasizing resource isolation, provisioning and monitoring [6]. Their study connects a repeatable experimental setup with the credibility of reported results. FaultNet records settings, runtime, sample counts and validated outcomes, and supplies analysis scripts for its tables and figures. The present evaluation retains ordinary desktop scheduling and one host, so the report confines its quantitative conclusions to that environment rather than claiming equivalent isolation or performance fidelity.</w:t>
       </w:r>
     </w:p>
     <w:p>
@@ -3627,16 +3569,11 @@
     </w:tbl>
     <w:p>
       <w:pPr>
-        <w:spacing w:after="40" w:line="240" w:lineRule="auto"/>
-        <w:jc w:val="both"/>
-      </w:pPr>
-    </w:p>
-    <w:p>
-      <w:pPr>
         <w:pStyle w:val="Heading1"/>
       </w:pPr>
-      <w:bookmarkStart w:id="5" w:name="_Toc244118949"/>
+      <w:bookmarkStart w:id="5" w:name="_Toc244121695"/>
       <w:r>
+        <w:lastRenderedPageBreak/>
         <w:t>5. Abstract</w:t>
       </w:r>
       <w:bookmarkEnd w:id="5"/>
@@ -3646,20 +3583,14 @@
         <w:jc w:val="both"/>
       </w:pPr>
       <w:r>
-        <w:t>FaultNet is a local HTTP resilience-testing system that combines automated experiments with manual development-proxy controls. The workbench coordinates baseline, faulty and recovery phases against a fixed 64 KiB response, validates observations and saves JSON evidence. The evaluation comprises 100 workbench runs with 1300 phase observations, 100 direct/proxy calibration requests and 80 live-proxy samples. Ten repeated runs are used per workbench configuration. The 1,500 ms delay condition adds a median 1,5</w:t>
-      </w:r>
-      <w:r>
-        <w:t>06.52 ms relative to matching baselines. At 16 KiB/s, observed payload goodput is 15.96 KiB/s, while the 128 KiB/s condition attains 61.81% of its configured rate. Increasing timeout from 500 to 2,000 ms under a fixed 1,000 ms delay changes faulty completion from 0% to 100%. Packet timings provide independent traffic evidence. Reviewed routing cases show that RIP and OSPF use the alternate path after the tested direct-link failure, whereas the static control lacks a backup route. The findings support contro</w:t>
-      </w:r>
-      <w:r>
-        <w:t>lled local fault testing and expose platform-dependent pacing limitations.</w:t>
+        <w:t>FaultNet is a local HTTP resilience-testing system that combines automated experiments with manual development-proxy controls. The workbench coordinates baseline, faulty and recovery phases against a fixed 64 KiB response, validates observations and saves JSON evidence. The evaluation comprises 100 workbench runs with 1300 phase observations, 100 direct/proxy calibration requests and 80 live-proxy samples. Ten repeated runs are used per workbench configuration. The 1,500 ms delay condition adds a median 1,506.52 ms relative to matching baselines. At 16 KiB/s, observed payload goodput is 15.96 KiB/s, while the 128 KiB/s condition attains 61.81% of its configured rate. Increasing timeout from 500 to 2,000 ms under a fixed 1,000 ms delay changes faulty completion from 0% to 100%. Packet timings provide independent traffic evidence. Reviewed routing cases show that RIP and OSPF use the alternate path after the tested direct-link failure, whereas the static control lacks a backup route. The findings support controlled local fault testing and expose platform-dependent pacing limitations.</w:t>
       </w:r>
     </w:p>
     <w:p>
       <w:pPr>
         <w:pStyle w:val="Heading1"/>
       </w:pPr>
-      <w:bookmarkStart w:id="6" w:name="_Toc244118950"/>
+      <w:bookmarkStart w:id="6" w:name="_Toc244121696"/>
       <w:r>
         <w:t>6. Workflow of the Proposed Project work and System Architecture</w:t>
       </w:r>
@@ -4115,7 +4046,7 @@
         <w:lastRenderedPageBreak/>
         <w:drawing>
           <wp:inline distT="0" distB="0" distL="0" distR="0" wp14:anchorId="621C1B8F" wp14:editId="6B5A26E5">
-            <wp:extent cx="5577840" cy="3022829"/>
+            <wp:extent cx="5577840" cy="3409836"/>
             <wp:effectExtent l="0" t="0" r="0" b="0"/>
             <wp:docPr id="2" name="Picture 2" descr="Control and data paths in FaultNet. The workbench and live proxy have independent fault configurations; replies return through the same proxy path."/>
             <wp:cNvGraphicFramePr>
@@ -4137,7 +4068,7 @@
                   <pic:spPr>
                     <a:xfrm>
                       <a:off x="0" y="0"/>
-                      <a:ext cx="5577840" cy="3022829"/>
+                      <a:ext cx="5577840" cy="3409836"/>
                     </a:xfrm>
                     <a:prstGeom prst="rect">
                       <a:avLst/>
@@ -4159,7 +4090,7 @@
         <w:rPr>
           <w:b w:val="0"/>
         </w:rPr>
-        <w:t>Figure 1. Control and data paths in FaultNet. The workbench and live proxy have independent fault configurations; replies return through the same proxy path.</w:t>
+        <w:t>Figure 1. Control, measurement and storage paths in FaultNet. Solid arrows show HTTP request/reply traffic; dashed arrows show internal control or record access.</w:t>
       </w:r>
     </w:p>
     <w:p>
@@ -4174,7 +4105,7 @@
       <w:pPr>
         <w:pStyle w:val="Heading2"/>
       </w:pPr>
-      <w:bookmarkStart w:id="7" w:name="_Toc244118951"/>
+      <w:bookmarkStart w:id="7" w:name="_Toc244121697"/>
       <w:r>
         <w:t>6.1 Dashboard Roles and Separation</w:t>
       </w:r>
@@ -4689,7 +4620,7 @@
       <w:pPr>
         <w:pStyle w:val="Heading2"/>
       </w:pPr>
-      <w:bookmarkStart w:id="8" w:name="_Toc244118952"/>
+      <w:bookmarkStart w:id="8" w:name="_Toc244121698"/>
       <w:r>
         <w:lastRenderedPageBreak/>
         <w:t>6.2 Workbench Functions and Fault Mechanisms</w:t>
@@ -5071,7 +5002,7 @@
       <w:pPr>
         <w:pStyle w:val="Heading2"/>
       </w:pPr>
-      <w:bookmarkStart w:id="9" w:name="_Toc244118953"/>
+      <w:bookmarkStart w:id="9" w:name="_Toc244121699"/>
       <w:r>
         <w:t>6.3 Live Proxy Cockpit Functions</w:t>
       </w:r>
@@ -5506,7 +5437,7 @@
       <w:pPr>
         <w:pStyle w:val="Heading1"/>
       </w:pPr>
-      <w:bookmarkStart w:id="10" w:name="_Toc244118954"/>
+      <w:bookmarkStart w:id="10" w:name="_Toc244121700"/>
       <w:r>
         <w:t>7. Contribution of Individual Team Member</w:t>
       </w:r>
@@ -5796,7 +5727,7 @@
       <w:pPr>
         <w:pStyle w:val="Heading1"/>
       </w:pPr>
-      <w:bookmarkStart w:id="11" w:name="_Toc244118955"/>
+      <w:bookmarkStart w:id="11" w:name="_Toc244121701"/>
       <w:r>
         <w:t>8. Modules Explanation</w:t>
       </w:r>
@@ -6475,7 +6406,7 @@
       <w:pPr>
         <w:pStyle w:val="Heading1"/>
       </w:pPr>
-      <w:bookmarkStart w:id="12" w:name="_Toc244118956"/>
+      <w:bookmarkStart w:id="12" w:name="_Toc244121702"/>
       <w:r>
         <w:t>9. Project Implementation</w:t>
       </w:r>
@@ -6485,7 +6416,7 @@
       <w:pPr>
         <w:pStyle w:val="Heading2"/>
       </w:pPr>
-      <w:bookmarkStart w:id="13" w:name="_Toc244118957"/>
+      <w:bookmarkStart w:id="13" w:name="_Toc244121703"/>
       <w:r>
         <w:t>9.1 Experimental Setup with Hardware and Software Requirements</w:t>
       </w:r>
@@ -6530,7 +6461,7 @@
         <w:jc w:val="both"/>
       </w:pPr>
       <w:r>
-        <w:t>Application revision: 313822e58f7d4420550a1836ebe949dc4727b88c. Evaluation scripts and sanitized numerical inputs: 515ff591e4433c98021599623c0b14664f17329a. Appendix A separates document regeneration, numerical recalculation and fresh collection.</w:t>
+        <w:t>Application revision: 313822e58f7d4420550a1836ebe949dc4727b88c. Evaluation scripts and sanitized numerical inputs: 515ff591e4433c98021599623c0b14664f17329a. Operational and reproduction instructions are provided in the repository README.</w:t>
       </w:r>
     </w:p>
     <w:p>
@@ -7068,7 +6999,7 @@
       <w:pPr>
         <w:pStyle w:val="Heading2"/>
       </w:pPr>
-      <w:bookmarkStart w:id="14" w:name="_Toc244118958"/>
+      <w:bookmarkStart w:id="14" w:name="_Toc244121704"/>
       <w:r>
         <w:t>9.2 Test Cases</w:t>
       </w:r>
@@ -7671,10 +7602,13 @@
         <w:jc w:val="both"/>
       </w:pPr>
       <w:r>
-        <w:t>Request success rate (%) equals 100 × successful attempts / eligible attempts; user cancellations are excluded from eligibility. For a successful fixed response, payload goodput (KiB/s) equals 64 / (elapsed milliseconds / 1,000); the table reports the arithmetic mean of these per-request rates. The mean of reciprocal durations need not equal 64 KiB divided by the median duration. The nearest-rank p95 uses position ceiling(0.95 × N) in sorted successful timings. These definitions preserve the distinction bet</w:t>
+        <w:t xml:space="preserve">Request success rate (%) equals 100 × successful attempts / eligible attempts; user cancellations are excluded from eligibility. For a successful fixed response, payload goodput (KiB/s) equals 64 / (elapsed milliseconds / 1,000); the table reports the arithmetic mean of these per-request rates. The mean of reciprocal durations need not equal 64 KiB divided by the median duration. The nearest-rank p95 uses position </w:t>
       </w:r>
       <w:r>
-        <w:t>ween slow success, failed completion and missing successful latency.</w:t>
+        <w:t>ceiling (</w:t>
+      </w:r>
+      <w:r>
+        <w:t>0.95 × N) in sorted successful timings. These definitions preserve the distinction between slow success, failed completion and missing successful latency.</w:t>
       </w:r>
     </w:p>
     <w:p>
@@ -7687,9 +7621,17 @@
     </w:p>
     <w:p>
       <w:pPr>
+        <w:jc w:val="both"/>
+      </w:pPr>
+      <w:r>
+        <w:t>A separate confirmation batch covered one additional run of each workbench condition, comprising 50 baseline, 50 faulty and 30 recovery observations. All ten records were saved successfully and confirmed recovery, with no validation rejection. Interruption and the 500 ms deadline produced 0/5 faulty successes; the remaining conditions produced 5/5. Eight live configurations were checked with ten requests each, followed by a reset that returned HTTP 200 and the complete 65,536-byte payload. These confirmation results are separate from the 100-run evaluation and do not replace its statistical estimates or packet and routing evidence.</w:t>
+      </w:r>
+    </w:p>
+    <w:p>
+      <w:pPr>
         <w:pStyle w:val="Heading2"/>
       </w:pPr>
-      <w:bookmarkStart w:id="15" w:name="_Toc244118959"/>
+      <w:bookmarkStart w:id="15" w:name="_Toc244121705"/>
       <w:r>
         <w:t>9.3 Results of Execution and Screenshots</w:t>
       </w:r>
@@ -7708,10 +7650,7 @@
         <w:jc w:val="both"/>
       </w:pPr>
       <w:r>
-        <w:t>Record quality is reported separately from request success. There were 101 attempted workbench runs: 100 supplied validated terminal records and 1 failed record validation. In the rejected bandwidth trial, UTC recovery duration and elapsed-clock duration differed by 2.38 ms, above the validator's 2 ms tolerance. The retained rejected record is excluded from timing aggregation and the condition is repeated to preserve the ten-run design. Thus 100 accepted runs do not imply that every attempted record was sav</w:t>
-      </w:r>
-      <w:r>
-        <w:t>ed successfully.</w:t>
+        <w:t>Record quality is reported separately from request success. There were 101 attempted workbench runs: 100 supplied validated terminal records and 1 failed record validation. In the rejected bandwidth trial, UTC recovery duration and elapsed-clock duration differed by 2.38 ms, above the validator's 2 ms tolerance. The retained rejected record is excluded from timing aggregation and the condition is repeated to preserve the ten-run design. Thus 100 accepted runs do not imply that every attempted record was saved successfully.</w:t>
       </w:r>
     </w:p>
     <w:p>
@@ -9177,7 +9116,7 @@
       <w:pPr>
         <w:pStyle w:val="Heading2"/>
       </w:pPr>
-      <w:bookmarkStart w:id="16" w:name="_Toc244118960"/>
+      <w:bookmarkStart w:id="16" w:name="_Toc244121706"/>
       <w:r>
         <w:lastRenderedPageBreak/>
         <w:t>9.4 Performance Analysis and Comparison of Methods</w:t>
@@ -9188,7 +9127,7 @@
       <w:pPr>
         <w:pStyle w:val="Heading3"/>
       </w:pPr>
-      <w:bookmarkStart w:id="17" w:name="_Toc244118961"/>
+      <w:bookmarkStart w:id="17" w:name="_Toc244121707"/>
       <w:r>
         <w:t>9.4.1 Delay Calibration and Distribution</w:t>
       </w:r>
@@ -9745,7 +9684,7 @@
         </w:rPr>
         <w:drawing>
           <wp:inline distT="0" distB="0" distL="0" distR="0" wp14:anchorId="5655B916" wp14:editId="31AA59B5">
-            <wp:extent cx="5577840" cy="3003728"/>
+            <wp:extent cx="5577840" cy="2999876"/>
             <wp:effectExtent l="0" t="0" r="0" b="0"/>
             <wp:docPr id="4" name="Picture 4" descr="Configured delay versus paired measured increase. Error bars are exploratory bootstrap intervals across ten runs."/>
             <wp:cNvGraphicFramePr>
@@ -9767,7 +9706,7 @@
                   <pic:spPr>
                     <a:xfrm>
                       <a:off x="0" y="0"/>
-                      <a:ext cx="5577840" cy="3003728"/>
+                      <a:ext cx="5577840" cy="2999876"/>
                     </a:xfrm>
                     <a:prstGeom prst="rect">
                       <a:avLst/>
@@ -9789,7 +9728,7 @@
         <w:rPr>
           <w:b w:val="0"/>
         </w:rPr>
-        <w:t>Figure 3. Configured delay versus paired measured increase. Error bars are exploratory bootstrap intervals across ten runs.</w:t>
+        <w:t>Figure 3. Paired added response time minus the configured delay. Zero indicates exact calibration; positive values show additional time. Error bars are exploratory 95% percentile bootstrap intervals across ten runs.</w:t>
       </w:r>
     </w:p>
     <w:p>
@@ -9797,10 +9736,7 @@
         <w:jc w:val="both"/>
       </w:pPr>
       <w:r>
-        <w:t>The 1,500 ms condition produced an added median of 1,506.52 ms, an error of 0.43%. The zero-delay condition adds 14.61 ms relative to its in-run no-fault baseline. Percentage error is undefined at a zero setting. This differs from the separate 2.32 ms direct-versus-fault-free-proxy estimate: both phases of a zero-delay run already traverse the proxy, and only the faulty phase dispatches the delay timer. The studies also use different sequences and background conditions. Timer dispatch and desktop scheduling</w:t>
-      </w:r>
-      <w:r>
-        <w:t xml:space="preserve"> are plausible contributors, but this dataset does not isolate the cause of the gap. A controlled follow-up should interleave fault-free proxy and zero-delay operations, instrument timer waits, and repeat under controlled load; 14.61 ms must not be subtracted as a universal correction.</w:t>
+        <w:t>The 1,500 ms condition produced an added median of 1,506.52 ms, an error of 0.43%. The zero-delay condition adds 14.61 ms relative to its in-run no-fault baseline. Percentage error is undefined at a zero setting. This differs from the separate 2.32 ms direct-versus-fault-free-proxy estimate: both phases of a zero-delay run already traverse the proxy, and only the faulty phase dispatches the delay timer. The studies also use different sequences and background conditions. Timer dispatch and desktop scheduling are plausible contributors, but this dataset does not isolate the cause of the gap. A controlled follow-up should interleave fault-free proxy and zero-delay operations, instrument timer waits, and repeat under controlled load; 14.61 ms must not be subtracted as a universal correction.</w:t>
       </w:r>
     </w:p>
     <w:p>
@@ -9874,7 +9810,7 @@
       <w:pPr>
         <w:pStyle w:val="Heading3"/>
       </w:pPr>
-      <w:bookmarkStart w:id="18" w:name="_Toc244118962"/>
+      <w:bookmarkStart w:id="18" w:name="_Toc244121708"/>
       <w:r>
         <w:t>9.4.2 Bandwidth Shaping and Rate Attainment</w:t>
       </w:r>
@@ -10481,10 +10417,7 @@
         <w:jc w:val="both"/>
       </w:pPr>
       <w:r>
-        <w:t xml:space="preserve">The 16 KiB/s condition attained 99.75% of its configured rate. The 128 KiB/s condition attained 61.81%, so the implementation should be interpreted as a delivery cap rather than a guarantee of exact target throughput. The 1 KiB schedule has nominal chunk intervals of 62.5, 31.25 and 7.8125 ms at 16, 32 and 128 KiB/s respectively. At short waits, timer dispatch and local scheduling can consume a larger fraction of the interval. This is a plausible explanation consistent with the mechanism; timer causes were </w:t>
-      </w:r>
-      <w:r>
-        <w:t>not independently isolated.</w:t>
+        <w:t>The 16 KiB/s condition attained 99.75% of its configured rate. The 128 KiB/s condition attained 61.81%, so the implementation should be interpreted as a delivery cap rather than a guarantee of exact target throughput. The 1 KiB schedule has nominal chunk intervals of 62.5, 31.25 and 7.8125 ms at 16, 32 and 128 KiB/s respectively. At short waits, timer dispatch and local scheduling can consume a larger fraction of the interval. This is a plausible explanation consistent with the mechanism; timer causes were not independently isolated.</w:t>
       </w:r>
     </w:p>
     <w:p>
@@ -10499,7 +10432,7 @@
       <w:pPr>
         <w:pStyle w:val="Heading3"/>
       </w:pPr>
-      <w:bookmarkStart w:id="19" w:name="_Toc244118963"/>
+      <w:bookmarkStart w:id="19" w:name="_Toc244121709"/>
       <w:r>
         <w:t>9.4.3 Timeout Tradeoff and Failure Outcomes</w:t>
       </w:r>
@@ -10584,7 +10517,7 @@
       <w:pPr>
         <w:pStyle w:val="Heading3"/>
       </w:pPr>
-      <w:bookmarkStart w:id="20" w:name="_Toc244118964"/>
+      <w:bookmarkStart w:id="20" w:name="_Toc244121710"/>
       <w:r>
         <w:t>9.4.4 Interception Cost and Recovery</w:t>
       </w:r>
@@ -11797,7 +11730,7 @@
       <w:pPr>
         <w:pStyle w:val="Heading3"/>
       </w:pPr>
-      <w:bookmarkStart w:id="21" w:name="_Toc244118965"/>
+      <w:bookmarkStart w:id="21" w:name="_Toc244121711"/>
       <w:r>
         <w:t>9.4.5 Live Proxy Evaluation</w:t>
       </w:r>
@@ -11866,10 +11799,7 @@
         <w:jc w:val="both"/>
       </w:pPr>
       <w:r>
-        <w:t>The cockpit snapshot shows 50 finished requests, 49 marked altered, 30 error/cancel outcomes and a 29.9 ms displayed median. These values summarize the latest monitor window, including earlier faulted requests; zero delay/rate settings do not erase that history. Reset removes active effects, while Clear monitor clears the visible history. The rolling monitor values are distinct from the eight-condition live study and the workbench's successful-response statistics. A display of error/cancel outcomes is not a</w:t>
-      </w:r>
-      <w:r>
-        <w:t>n IP packet-loss measurement.</w:t>
+        <w:t>The cockpit snapshot shows 50 finished requests, 49 marked altered, 30 error/cancel outcomes and a 29.9 ms displayed median. These values summarize the latest monitor window, including earlier faulted requests; zero delay/rate settings do not erase that history. Reset removes active effects, while Clear monitor clears the visible history. The rolling monitor values are distinct from the eight-condition live study and the workbench's successful-response statistics. A display of error/cancel outcomes is not an IP packet-loss measurement.</w:t>
       </w:r>
     </w:p>
     <w:p>
@@ -13153,7 +13083,7 @@
       <w:pPr>
         <w:pStyle w:val="Heading3"/>
       </w:pPr>
-      <w:bookmarkStart w:id="22" w:name="_Toc244118966"/>
+      <w:bookmarkStart w:id="22" w:name="_Toc244121712"/>
       <w:r>
         <w:lastRenderedPageBreak/>
         <w:t>9.4.6 Packet Evidence and Timing Correlation</w:t>
@@ -13681,17 +13611,14 @@
         <w:jc w:val="both"/>
       </w:pPr>
       <w:r>
-        <w:t>The matched streams distinguish first response data, the packet completing HTTP reconstruction and completion of the application's read. The measured intervals can therefore differ without contradiction. Stream matching supplies the local evidence for this distinction. Paxson's analysis motivates separating packet observations from transport effects [4]. Application elapsed time and reconstructed-response intervals measure different stages of an exchange; neither is TCP acknowledgement RTT. Capture loss des</w:t>
-      </w:r>
-      <w:r>
-        <w:t>cribes recording loss and must be reported separately from injected HTTP failures.</w:t>
+        <w:t>The matched streams distinguish first response data, the packet completing HTTP reconstruction and completion of the application's read. The measured intervals can therefore differ without contradiction. Stream matching supplies the local evidence for this distinction. Paxson's analysis motivates separating packet observations from transport effects [4]. Application elapsed time and reconstructed-response intervals measure different stages of an exchange; neither is TCP acknowledgement RTT. Capture loss describes recording loss and must be reported separately from injected HTTP failures.</w:t>
       </w:r>
     </w:p>
     <w:p>
       <w:pPr>
         <w:pStyle w:val="Heading3"/>
       </w:pPr>
-      <w:bookmarkStart w:id="23" w:name="_Toc244118967"/>
+      <w:bookmarkStart w:id="23" w:name="_Toc244121713"/>
       <w:r>
         <w:lastRenderedPageBreak/>
         <w:t>9.4.7 Routing Comparison in Packet Tracer</w:t>
@@ -14346,17 +14273,14 @@
         <w:jc w:val="both"/>
       </w:pPr>
       <w:r>
-        <w:t>Dynamic routing preserved reachability in the settled fault state of this topology, while the deliberately unprotected static configuration did not. Static routing can be configured with backup routes; the result is not a universal failure of static routing. Warm-up and restoration batches included transient losses. Fast Forward Time advanced the simulator, so the records do not support wall-clock convergence comparisons or a claim that OSPF was faster than RIP. Route selection, next hop and reachability es</w:t>
-      </w:r>
-      <w:r>
-        <w:t>tablish the demonstrated benefit.</w:t>
+        <w:t>Dynamic routing preserved reachability in the settled fault state of this topology, while the deliberately unprotected static configuration did not. Static routing can be configured with backup routes; the result is not a universal failure of static routing. Warm-up and restoration batches included transient losses. Fast Forward Time advanced the simulator, so the records do not support wall-clock convergence comparisons or a claim that OSPF was faster than RIP. Route selection, next hop and reachability establish the demonstrated benefit.</w:t>
       </w:r>
     </w:p>
     <w:p>
       <w:pPr>
         <w:pStyle w:val="Heading2"/>
       </w:pPr>
-      <w:bookmarkStart w:id="24" w:name="_Toc244118968"/>
+      <w:bookmarkStart w:id="24" w:name="_Toc244121714"/>
       <w:r>
         <w:t>9.5 Critical Evaluation and Optimization</w:t>
       </w:r>
@@ -14391,7 +14315,7 @@
       <w:pPr>
         <w:pStyle w:val="Heading1"/>
       </w:pPr>
-      <w:bookmarkStart w:id="25" w:name="_Toc244118969"/>
+      <w:bookmarkStart w:id="25" w:name="_Toc244121715"/>
       <w:r>
         <w:t>10. Results and Discussion</w:t>
       </w:r>
@@ -14401,7 +14325,7 @@
       <w:pPr>
         <w:pStyle w:val="Heading2"/>
       </w:pPr>
-      <w:bookmarkStart w:id="26" w:name="_Toc244118970"/>
+      <w:bookmarkStart w:id="26" w:name="_Toc244121716"/>
       <w:r>
         <w:t>10.1 Findings and Inferences</w:t>
       </w:r>
@@ -14443,7 +14367,7 @@
       <w:pPr>
         <w:pStyle w:val="Heading2"/>
       </w:pPr>
-      <w:bookmarkStart w:id="27" w:name="_Toc244118971"/>
+      <w:bookmarkStart w:id="27" w:name="_Toc244121717"/>
       <w:r>
         <w:t>10.2 Innovation Novelty and Evidence</w:t>
       </w:r>
@@ -14454,10 +14378,13 @@
         <w:jc w:val="both"/>
       </w:pPr>
       <w:r>
-        <w:t>Published studies already establish deliberate fault experiments [1], outcome-guided fault selection [2] and controllable network emulation [3]. FaultNet's contribution is the integration of local HTTP fault settings, validated phase observations, saved evidence and a separate live development interface into an inspectable teaching workflow. The project does not claim a new fault-injection principle, routing protocol or performance advantage over these research systems. Its quantitative findings concern the</w:t>
+        <w:t>Published studies already establish deliberate fault experiments [1], outcome-guided fault selection [2] and controllable network emulation [3]. FaultNet's contribution is the integration of local HTTP fault settings, validated phase observations, saved evidence and a separate live development interface into an inspectable teaching workflow. The project</w:t>
       </w:r>
       <w:r>
-        <w:t xml:space="preserve"> measured FaultNet configuration.</w:t>
+        <w:t>’s</w:t>
+      </w:r>
+      <w:r>
+        <w:t xml:space="preserve"> quantitative findings concern the measured FaultNet configuration.</w:t>
       </w:r>
     </w:p>
     <w:p>
@@ -14465,14 +14392,14 @@
         <w:jc w:val="both"/>
       </w:pPr>
       <w:r>
-        <w:t>Useful improvement claims are attached to actual comparisons. The longer deadline improves completion for the chosen delayed workload, and dynamic route selection improves settled reachability over the no-backup control in the reviewed topology. Neither claim implies general superiority over unrelated systems. Calibration and interception results identify costs as well as benefits.</w:t>
+        <w:t>Useful improvement claims are attached to actual comparisons. The longer deadline improves completion for the chosen delayed workload, and dynamic route selection improves settled reachability over the no-backup control in the reviewed topology. Calibration and interception results identify costs as well as benefits.</w:t>
       </w:r>
     </w:p>
     <w:p>
       <w:pPr>
         <w:pStyle w:val="Heading1"/>
       </w:pPr>
-      <w:bookmarkStart w:id="28" w:name="_Toc244118972"/>
+      <w:bookmarkStart w:id="28" w:name="_Toc244121718"/>
       <w:r>
         <w:t>11. Conclusion</w:t>
       </w:r>
@@ -14483,18 +14410,18 @@
         <w:jc w:val="both"/>
       </w:pPr>
       <w:r>
-        <w:t xml:space="preserve">FaultNet implements controlled HTTP fault injection with saved experiments and a separate live development cockpit. A repeated evaluation of 100 workbench runs supports measurable delay, pacing, failure and restoration behavior. The timeout comparison improves observed </w:t>
+        <w:t xml:space="preserve">FaultNet implements controlled HTTP fault injection with saved experiments and a separate live development cockpit. A repeated evaluation of 100 workbench runs supports measurable delay, pacing, failure and restoration behavior. The timeout comparison improves observed completion from 0% to 100% by permitting longer waiting, while the high-rate pacing result exposes a concrete limitation. Packet analysis and reviewed routing observations provide </w:t>
       </w:r>
       <w:r>
         <w:lastRenderedPageBreak/>
-        <w:t>completion from 0% to 100% by permitting longer waiting, while the high-rate pacing result exposes a concrete limitation. Packet analysis and reviewed routing observations provide complementary evidence. The system is useful for local development testing and networking education because configurations, measurements and explanations can be examined together.</w:t>
+        <w:t>complementary evidence. The system is useful for local development testing and networking education because configurations, measurements and explanations can be examined together.</w:t>
       </w:r>
     </w:p>
     <w:p>
       <w:pPr>
         <w:pStyle w:val="Heading1"/>
       </w:pPr>
-      <w:bookmarkStart w:id="29" w:name="_Toc244118973"/>
+      <w:bookmarkStart w:id="29" w:name="_Toc244121719"/>
       <w:r>
         <w:t>12. Limitations and Future Enhancement</w:t>
       </w:r>
@@ -14537,7 +14464,7 @@
         <w:pStyle w:val="Heading1"/>
         <w:pageBreakBefore/>
       </w:pPr>
-      <w:bookmarkStart w:id="30" w:name="_Toc244118974"/>
+      <w:bookmarkStart w:id="30" w:name="_Toc244121720"/>
       <w:r>
         <w:lastRenderedPageBreak/>
         <w:t>References</w:t>
@@ -14545,19 +14472,8 @@
       <w:bookmarkEnd w:id="30"/>
     </w:p>
     <w:p>
-      <w:pPr>
-        <w:keepNext/>
-      </w:pPr>
       <w:r>
-        <w:t>[1] A. Basiri, N. Behnam, R. de Rooij, L. Hochstein, L. Kosewski, J. Reynolds, and C. Rosenthal, “Chaos Engineering,” IEEE Software, vol. 33, no. 3, pp. 35–41, 2016.</w:t>
-      </w:r>
-    </w:p>
-    <w:p>
-      <w:pPr>
-        <w:keepNext/>
-      </w:pPr>
-      <w:r>
-        <w:t xml:space="preserve">DOI: </w:t>
+        <w:t xml:space="preserve">[1] A. Basiri, N. Behnam, R. de Rooij, L. Hochstein, L. Kosewski, J. Reynolds, and C. Rosenthal, “Chaos Engineering,” IEEE Software, vol. 33, no. 3, pp. 35–41, 2016. doi: </w:t>
       </w:r>
       <w:hyperlink r:id="rId23">
         <w:r>
@@ -14567,30 +14483,9 @@
     </w:p>
     <w:p>
       <w:r>
-        <w:t xml:space="preserve">Free full text: </w:t>
+        <w:t xml:space="preserve">[2] P. Alvaro, J. Rosen, and J. M. Hellerstein, “Lineage-driven Fault Injection,” Proceedings of the ACM SIGMOD International Conference on Management of Data, pp. 331–346, 2015. doi: </w:t>
       </w:r>
       <w:hyperlink r:id="rId24">
-        <w:r>
-          <w:t>Full author manuscript deposited on arXiv</w:t>
-        </w:r>
-      </w:hyperlink>
-    </w:p>
-    <w:p>
-      <w:pPr>
-        <w:keepNext/>
-      </w:pPr>
-      <w:r>
-        <w:t>[2] P. Alvaro, J. Rosen, and J. M. Hellerstein, “Lineage-driven Fault Injection,” Proceedings of the ACM SIGMOD International Conference on Management of Data, pp. 331–346, 2015.</w:t>
-      </w:r>
-    </w:p>
-    <w:p>
-      <w:pPr>
-        <w:keepNext/>
-      </w:pPr>
-      <w:r>
-        <w:t xml:space="preserve">DOI: </w:t>
-      </w:r>
-      <w:hyperlink r:id="rId25">
         <w:r>
           <w:t>10.1145/2723372.2723711</w:t>
         </w:r>
@@ -14598,30 +14493,9 @@
     </w:p>
     <w:p>
       <w:r>
-        <w:t xml:space="preserve">Free full text: </w:t>
+        <w:t xml:space="preserve">[3] M. Carbone and L. Rizzo, “Dummynet Revisited,” ACM SIGCOMM Computer Communication Review, vol. 40, no. 2, pp. 12–20, 2010. doi: </w:t>
       </w:r>
-      <w:hyperlink r:id="rId26">
-        <w:r>
-          <w:t>Full paper hosted by the author at UC Santa Cruz</w:t>
-        </w:r>
-      </w:hyperlink>
-    </w:p>
-    <w:p>
-      <w:pPr>
-        <w:keepNext/>
-      </w:pPr>
-      <w:r>
-        <w:t>[3] M. Carbone and L. Rizzo, “Dummynet Revisited,” ACM SIGCOMM Computer Communication Review, vol. 40, no. 2, pp. 12–20, 2010.</w:t>
-      </w:r>
-    </w:p>
-    <w:p>
-      <w:pPr>
-        <w:keepNext/>
-      </w:pPr>
-      <w:r>
-        <w:t xml:space="preserve">DOI: </w:t>
-      </w:r>
-      <w:hyperlink r:id="rId27">
+      <w:hyperlink r:id="rId25">
         <w:r>
           <w:t>10.1145/1764873.1764876</w:t>
         </w:r>
@@ -14629,30 +14503,9 @@
     </w:p>
     <w:p>
       <w:r>
-        <w:t xml:space="preserve">Free full text: </w:t>
+        <w:t xml:space="preserve">[4] V. Paxson, “End-to-End Internet Packet Dynamics,” Proceedings of ACM SIGCOMM, pp. 139–152, 1997. doi: </w:t>
       </w:r>
-      <w:hyperlink r:id="rId28">
-        <w:r>
-          <w:t>Full author manuscript hosted at the University of Pisa</w:t>
-        </w:r>
-      </w:hyperlink>
-    </w:p>
-    <w:p>
-      <w:pPr>
-        <w:keepNext/>
-      </w:pPr>
-      <w:r>
-        <w:t>[4] V. Paxson, “End-to-End Internet Packet Dynamics,” Proceedings of ACM SIGCOMM, pp. 139–152, 1997.</w:t>
-      </w:r>
-    </w:p>
-    <w:p>
-      <w:pPr>
-        <w:keepNext/>
-      </w:pPr>
-      <w:r>
-        <w:t xml:space="preserve">DOI: </w:t>
-      </w:r>
-      <w:hyperlink r:id="rId29">
+      <w:hyperlink r:id="rId26">
         <w:r>
           <w:t>10.1145/263105.263155</w:t>
         </w:r>
@@ -14660,30 +14513,9 @@
     </w:p>
     <w:p>
       <w:r>
-        <w:t xml:space="preserve">Free full text: </w:t>
+        <w:t xml:space="preserve">[5] B. Lantz, B. Heller, and N. McKeown, “A Network in a Laptop: Rapid Prototyping for Software-Defined Networks,” Proceedings of the 9th ACM SIGCOMM Workshop on Hot Topics in Networks, pp. 1–6, 2010. doi: </w:t>
       </w:r>
-      <w:hyperlink r:id="rId30">
-        <w:r>
-          <w:t>Full conference paper hosted at UC San Diego</w:t>
-        </w:r>
-      </w:hyperlink>
-    </w:p>
-    <w:p>
-      <w:pPr>
-        <w:keepNext/>
-      </w:pPr>
-      <w:r>
-        <w:t>[5] B. Lantz, B. Heller, and N. McKeown, “A Network in a Laptop: Rapid Prototyping for Software-Defined Networks,” Proceedings of the 9th ACM SIGCOMM Workshop on Hot Topics in Networks, pp. 1–6, 2010.</w:t>
-      </w:r>
-    </w:p>
-    <w:p>
-      <w:pPr>
-        <w:keepNext/>
-      </w:pPr>
-      <w:r>
-        <w:t xml:space="preserve">DOI: </w:t>
-      </w:r>
-      <w:hyperlink r:id="rId31">
+      <w:hyperlink r:id="rId27">
         <w:r>
           <w:t>10.1145/1868447.1868466</w:t>
         </w:r>
@@ -14691,126 +14523,16 @@
     </w:p>
     <w:p>
       <w:r>
-        <w:t xml:space="preserve">Free full text: </w:t>
+        <w:t xml:space="preserve">[6] N. Handigol, B. Heller, V. Jeyakumar, B. Lantz, and N. McKeown, “Reproducible Network Experiments Using Container-Based Emulation,” Proceedings of the 8th International Conference on Emerging Networking Experiments and Technologies (CoNEXT), pp. 253–264, 2012. doi: </w:t>
       </w:r>
-      <w:hyperlink r:id="rId32">
-        <w:r>
-          <w:t>Full workshop paper hosted by the author at Stanford University</w:t>
-        </w:r>
-      </w:hyperlink>
-    </w:p>
-    <w:p>
-      <w:pPr>
-        <w:keepNext/>
-      </w:pPr>
-      <w:r>
-        <w:t>[6] N. Handigol, B. Heller, V. Jeyakumar, B. Lantz, and N. McKeown, “Reproducible Network Experiments Using Container-Based Emulation,” Proceedings of the 8th International Conference on Emerging Networking Experiments and Technologies (CoNEXT), pp. 253–264, 2012.</w:t>
-      </w:r>
-    </w:p>
-    <w:p>
-      <w:pPr>
-        <w:keepNext/>
-      </w:pPr>
-      <w:r>
-        <w:t xml:space="preserve">DOI: </w:t>
-      </w:r>
-      <w:hyperlink r:id="rId33">
+      <w:hyperlink r:id="rId28">
         <w:r>
           <w:t>10.1145/2413176.2413206</w:t>
         </w:r>
       </w:hyperlink>
     </w:p>
-    <w:p>
-      <w:r>
-        <w:t xml:space="preserve">Free full text: </w:t>
-      </w:r>
-      <w:hyperlink r:id="rId34">
-        <w:r>
-          <w:t>Full published conference paper from the ACM SIGCOMM conference proceedings site</w:t>
-        </w:r>
-      </w:hyperlink>
-    </w:p>
-    <w:p>
-      <w:r>
-        <w:t xml:space="preserve">Additional author copy: </w:t>
-      </w:r>
-      <w:hyperlink r:id="rId35">
-        <w:r>
-          <w:t>Stanford-hosted full conference paper</w:t>
-        </w:r>
-      </w:hyperlink>
-    </w:p>
-    <w:p>
-      <w:pPr>
-        <w:pStyle w:val="Heading1"/>
-        <w:pageBreakBefore/>
-      </w:pPr>
-      <w:bookmarkStart w:id="31" w:name="_Toc244118975"/>
-      <w:r>
-        <w:lastRenderedPageBreak/>
-        <w:t>Appendix A Reproduction Procedure</w:t>
-      </w:r>
-      <w:bookmarkEnd w:id="31"/>
-    </w:p>
-    <w:p>
-      <w:pPr>
-        <w:jc w:val="both"/>
-      </w:pPr>
-      <w:r>
-        <w:t>The pinned evidence revision in section 9.1 contains evaluation/analysis scripts and the numerical inputs used for the published results. It preserves the original measurements; recalculation is not a new experiment. The later report revision contains the document builder and the revised prose/layout.</w:t>
-      </w:r>
-    </w:p>
-    <w:p>
-      <w:pPr>
-        <w:jc w:val="both"/>
-      </w:pPr>
-      <w:r>
-        <w:t>1. Regenerate the document: use the report revision identified in FINAL-REPORT-HANDOFF.md, install Python packages python-docx and pypdf, run python scripts/build-final-report.py, then use Microsoft Word to refresh the contents and export the PDF (scripts/export-report.ps1). This reads committed aggregates and figures; it does not recalculate results. Close or save any open report before rebuilding. The preserved partial report supplies the course cover and declaration.</w:t>
-      </w:r>
-    </w:p>
-    <w:p>
-      <w:pPr>
-        <w:jc w:val="both"/>
-      </w:pPr>
-      <w:r>
-        <w:t>2. Recalculate numerical results: install matplotlib and numpy, then run python scripts/analyze-report.py from the repository. The default input is docs/reports/evidence/analysis-inputs.json. It contains the original numerical phase durations, success flags, recovery durations, overhead blocks and live outcomes, without session capabilities, HTTP bodies or wall-clock timestamps. It reproduces the workbench/live/overhead statistics, bootstrap intervals and their figures. The rejection count and clock discrep</w:t>
-      </w:r>
-      <w:r>
-        <w:t>ancy are retained audit facts; this reduced dataset cannot revalidate the original record chronology.</w:t>
-      </w:r>
-    </w:p>
-    <w:p>
-      <w:pPr>
-        <w:jc w:val="both"/>
-      </w:pPr>
-      <w:r>
-        <w:t>3. Packet and routing evidence: the committed packet summary allows inspection of the 15 matched timings and frame references, but independently decoding streams or checking capture completeness requires the original local capture. Route excerpts and ping summaries document the bounded simulator review; reproducing that execution requires Packet Tracer 9.0.1 and the separately pinned lab files. Sanitized inputs do not replace packet capture or simulator execution.</w:t>
-      </w:r>
-    </w:p>
-    <w:p>
-      <w:pPr>
-        <w:jc w:val="both"/>
-      </w:pPr>
-      <w:r>
-        <w:t>4. Collect replacement measurements: use Node 22.23.1 and npm start on an idle local setup, then node scripts/evaluate-report.mjs. The collector checks application files against the pinned application baseline. Preserve any rejected record and resume only after review. Run python scripts/prepare-report-inputs.py to derive a sanitized numerical dataset, then analyze it. Fresh timings will differ and must be labelled as a replacement evaluation; never silently combine new samples with this study. Follow the e</w:t>
-      </w:r>
-      <w:r>
-        <w:t>vidence guide for optional loopback capture and packet correlation.</w:t>
-      </w:r>
-    </w:p>
-    <w:p>
-      <w:pPr>
-        <w:jc w:val="both"/>
-      </w:pPr>
-      <w:r>
-        <w:t>Separate confirmation check. A fresh execution of the unchanged application passed all 61 automated tests with zero failures, skips or cancellations. One additional run of each of the ten workbench conditions produced 130 phase observations (50 baseline, 50 faulty and 30 recovery); all ten records saved successfully and confirmed recovery, with no validation rejection. Interruption and the 500 ms deadline produced 0/5 faulty successes; the remaining conditions produced 5/5. Eight live configurations were ex</w:t>
-      </w:r>
-      <w:r>
-        <w:t>ercised with ten samples each, and the final reset returned HTTP 200 with 65,536 bytes. This bounded confirmation is recorded in evidence/followup-verification.json and is separate from the original 100-run study: it does not replace its statistics, intervals, packet capture or routing observations.</w:t>
-      </w:r>
-    </w:p>
     <w:sectPr>
-      <w:footerReference w:type="default" r:id="rId36"/>
+      <w:footerReference w:type="default" r:id="rId29"/>
       <w:pgSz w:w="11909" w:h="16834"/>
       <w:pgMar w:top="1224" w:right="1368" w:bottom="1224" w:left="1368" w:header="720" w:footer="576" w:gutter="0"/>
       <w:cols w:space="720"/>

</xml_diff>